<commit_message>
Part 3 Task 3 Deep Learning with Explainability
</commit_message>
<xml_diff>
--- a/capstone_part3/Part3DEliverablesExecutionOutput.docx
+++ b/capstone_part3/Part3DEliverablesExecutionOutput.docx
@@ -853,6 +853,444 @@
                     <a:xfrm>
                       <a:off x="0" y="0"/>
                       <a:ext cx="6035040" cy="1062260"/>
+                    </a:xfrm>
+                    <a:prstGeom prst="rect">
+                      <a:avLst/>
+                    </a:prstGeom>
+                  </pic:spPr>
+                </pic:pic>
+              </a:graphicData>
+            </a:graphic>
+          </wp:inline>
+        </w:drawing>
+      </w:r>
+    </w:p>
+    <w:p>
+      <w:r>
+        <w:br w:type="page"/>
+      </w:r>
+    </w:p>
+    <w:p>
+      <w:pPr>
+        <w:pStyle w:val="Heading1"/>
+        <w:rPr>
+          <w:b/>
+          <w:bCs/>
+        </w:rPr>
+      </w:pPr>
+      <w:r>
+        <w:rPr>
+          <w:b/>
+          <w:bCs/>
+        </w:rPr>
+        <w:lastRenderedPageBreak/>
+        <w:t>Task 3 Deep Learning with Explainability</w:t>
+      </w:r>
+    </w:p>
+    <w:p>
+      <w:pPr>
+        <w:pStyle w:val="Heading2"/>
+      </w:pPr>
+      <w:r>
+        <w:t>Packages and data preparation</w:t>
+      </w:r>
+    </w:p>
+    <w:p>
+      <w:r>
+        <w:t>TensorFlow 2.21.0 and SHAP 0.53.0 imported successfully. The original dataset and reusable cleaning functions reproduced the Task 1 data preparation and chronological split: 35873 training records, 7370 validation records and 4944 test records. Records sharing a timestamp remained together. Invalid readings were imputed using the training-only medians saved in Task 1.</w:t>
+      </w:r>
+    </w:p>
+    <w:p>
+      <w:r>
+        <w:t>The same 16 numeric inputs and weather category were prepared. The saved Random Forest preprocessor, fitted only on training data, produced 27 transformed features for both models. Traffic volume was the target and was excluded from the predictors. Task 3 estimates recorded traffic volume from time and weather features; it does not forecast a sequence of future observations.</w:t>
+      </w:r>
+    </w:p>
+    <w:p>
+      <w:r>
+        <w:rPr>
+          <w:noProof/>
+        </w:rPr>
+        <w:drawing>
+          <wp:inline distT="0" distB="0" distL="0" distR="0" wp14:anchorId="4C1829B9" wp14:editId="56058216">
+            <wp:extent cx="6035040" cy="861110"/>
+            <wp:effectExtent l="0" t="0" r="0" b="0"/>
+            <wp:docPr id="12" name="Picture 12"/>
+            <wp:cNvGraphicFramePr>
+              <a:graphicFrameLocks xmlns:a="http://schemas.openxmlformats.org/drawingml/2006/main" noChangeAspect="1"/>
+            </wp:cNvGraphicFramePr>
+            <a:graphic xmlns:a="http://schemas.openxmlformats.org/drawingml/2006/main">
+              <a:graphicData uri="http://schemas.openxmlformats.org/drawingml/2006/picture">
+                <pic:pic xmlns:pic="http://schemas.openxmlformats.org/drawingml/2006/picture">
+                  <pic:nvPicPr>
+                    <pic:cNvPr id="0" name="evidence_12.png"/>
+                    <pic:cNvPicPr/>
+                  </pic:nvPicPr>
+                  <pic:blipFill>
+                    <a:blip r:embed="rId16"/>
+                    <a:stretch>
+                      <a:fillRect/>
+                    </a:stretch>
+                  </pic:blipFill>
+                  <pic:spPr>
+                    <a:xfrm>
+                      <a:off x="0" y="0"/>
+                      <a:ext cx="6035040" cy="861110"/>
+                    </a:xfrm>
+                    <a:prstGeom prst="rect">
+                      <a:avLst/>
+                    </a:prstGeom>
+                  </pic:spPr>
+                </pic:pic>
+              </a:graphicData>
+            </a:graphic>
+          </wp:inline>
+        </w:drawing>
+      </w:r>
+    </w:p>
+    <w:p>
+      <w:pPr>
+        <w:pStyle w:val="Heading2"/>
+      </w:pPr>
+      <w:r>
+        <w:t>Neural network training</w:t>
+      </w:r>
+    </w:p>
+    <w:p>
+      <w:r>
+        <w:t xml:space="preserve">The feedforward network used two hidden layers with 64 and 32 ReLU neurons and a single linear output. Training used Adam with learning </w:t>
+      </w:r>
+      <w:proofErr w:type="spellStart"/>
+      <w:r>
+        <w:t>ra</w:t>
+      </w:r>
+      <w:r>
+        <w:t>t</w:t>
+      </w:r>
+      <w:r>
+        <w:t>te</w:t>
+      </w:r>
+      <w:proofErr w:type="spellEnd"/>
+      <w:r>
+        <w:t xml:space="preserve"> 0.001, mean squared error loss and batch size 256. The </w:t>
+      </w:r>
+      <w:proofErr w:type="spellStart"/>
+      <w:r>
+        <w:t>trget</w:t>
+      </w:r>
+      <w:proofErr w:type="spellEnd"/>
+      <w:r>
+        <w:t xml:space="preserve"> was standardised using the training mean and standard deviation. Earl</w:t>
+      </w:r>
+      <w:r>
+        <w:t xml:space="preserve"> </w:t>
+      </w:r>
+      <w:r>
+        <w:t xml:space="preserve">y stopping monitored validation loss with patience 10 and restored the best weights. Training completed on the CPU after 37 epochs; the best validation loss occurred at epoch 27. </w:t>
+      </w:r>
+    </w:p>
+    <w:p>
+      <w:pPr>
+        <w:pStyle w:val="Heading2"/>
+      </w:pPr>
+      <w:r>
+        <w:t>Training curve and validation comparison</w:t>
+      </w:r>
+    </w:p>
+    <w:p>
+      <w:r>
+        <w:t>Training and validation loss decreased sharply during the early epochs. Validation loss then levelled off while training loss continued to decrease. Early stopping retained epoch 27. The chart shows loss on the standardised target; prediction metrics below use original traffic-volume units.</w:t>
+      </w:r>
+    </w:p>
+    <w:p>
+      <w:r>
+        <w:rPr>
+          <w:noProof/>
+        </w:rPr>
+        <w:drawing>
+          <wp:inline distT="0" distB="0" distL="0" distR="0" wp14:anchorId="2C5C64B4" wp14:editId="6F9017A4">
+            <wp:extent cx="6035040" cy="3323120"/>
+            <wp:effectExtent l="0" t="0" r="0" b="0"/>
+            <wp:docPr id="13" name="Picture 13"/>
+            <wp:cNvGraphicFramePr>
+              <a:graphicFrameLocks xmlns:a="http://schemas.openxmlformats.org/drawingml/2006/main" noChangeAspect="1"/>
+            </wp:cNvGraphicFramePr>
+            <a:graphic xmlns:a="http://schemas.openxmlformats.org/drawingml/2006/main">
+              <a:graphicData uri="http://schemas.openxmlformats.org/drawingml/2006/picture">
+                <pic:pic xmlns:pic="http://schemas.openxmlformats.org/drawingml/2006/picture">
+                  <pic:nvPicPr>
+                    <pic:cNvPr id="0" name="neural_network_training_curve.png"/>
+                    <pic:cNvPicPr/>
+                  </pic:nvPicPr>
+                  <pic:blipFill>
+                    <a:blip r:embed="rId17"/>
+                    <a:stretch>
+                      <a:fillRect/>
+                    </a:stretch>
+                  </pic:blipFill>
+                  <pic:spPr>
+                    <a:xfrm>
+                      <a:off x="0" y="0"/>
+                      <a:ext cx="6035040" cy="3323120"/>
+                    </a:xfrm>
+                    <a:prstGeom prst="rect">
+                      <a:avLst/>
+                    </a:prstGeom>
+                  </pic:spPr>
+                </pic:pic>
+              </a:graphicData>
+            </a:graphic>
+          </wp:inline>
+        </w:drawing>
+      </w:r>
+    </w:p>
+    <w:p>
+      <w:r>
+        <w:lastRenderedPageBreak/>
+        <w:t>The neural network achieved validation MAE 316.4414 and R squared 0.9307. The comparable Random Forest achieved MAE 317.5692 and R squared 0.9256. Their validation MAE values were close, with the neural network slightly lower</w:t>
+      </w:r>
+    </w:p>
+    <w:p>
+      <w:pPr>
+        <w:rPr>
+          <w:b/>
+          <w:bCs/>
+        </w:rPr>
+      </w:pPr>
+      <w:r>
+        <w:rPr>
+          <w:b/>
+          <w:bCs/>
+        </w:rPr>
+        <w:t>Held out test evaluation</w:t>
+      </w:r>
+    </w:p>
+    <w:p>
+      <w:r>
+        <w:t>Both fixed models were evaluated on the same chronological test records without further tuning. The neural network achieved test MAE 256.9366 and R squared 0.9455. Random Forest achieved MAE 250.8358 and R squared 0.9448. Random Forest had slightly lower MAE, while the neural network had slightly higher R squared. These metrics do not establish that one model is universally better.</w:t>
+      </w:r>
+    </w:p>
+    <w:p>
+      <w:r>
+        <w:rPr>
+          <w:noProof/>
+        </w:rPr>
+        <w:drawing>
+          <wp:inline distT="0" distB="0" distL="0" distR="0" wp14:anchorId="05E7EF02" wp14:editId="2DC8E017">
+            <wp:extent cx="6035040" cy="870552"/>
+            <wp:effectExtent l="0" t="0" r="0" b="0"/>
+            <wp:docPr id="14" name="Picture 14"/>
+            <wp:cNvGraphicFramePr>
+              <a:graphicFrameLocks xmlns:a="http://schemas.openxmlformats.org/drawingml/2006/main" noChangeAspect="1"/>
+            </wp:cNvGraphicFramePr>
+            <a:graphic xmlns:a="http://schemas.openxmlformats.org/drawingml/2006/main">
+              <a:graphicData uri="http://schemas.openxmlformats.org/drawingml/2006/picture">
+                <pic:pic xmlns:pic="http://schemas.openxmlformats.org/drawingml/2006/picture">
+                  <pic:nvPicPr>
+                    <pic:cNvPr id="0" name="evidence_14.png"/>
+                    <pic:cNvPicPr/>
+                  </pic:nvPicPr>
+                  <pic:blipFill>
+                    <a:blip r:embed="rId18"/>
+                    <a:stretch>
+                      <a:fillRect/>
+                    </a:stretch>
+                  </pic:blipFill>
+                  <pic:spPr>
+                    <a:xfrm>
+                      <a:off x="0" y="0"/>
+                      <a:ext cx="6035040" cy="870552"/>
+                    </a:xfrm>
+                    <a:prstGeom prst="rect">
+                      <a:avLst/>
+                    </a:prstGeom>
+                  </pic:spPr>
+                </pic:pic>
+              </a:graphicData>
+            </a:graphic>
+          </wp:inline>
+        </w:drawing>
+      </w:r>
+    </w:p>
+    <w:p>
+      <w:pPr>
+        <w:pStyle w:val="Heading2"/>
+      </w:pPr>
+      <w:r>
+        <w:t>Explainability approach</w:t>
+      </w:r>
+    </w:p>
+    <w:p>
+      <w:r>
+        <w:t>SHAP explained the Task 1 Random Forest regression model, which used the same features and prediction target as the neural network. These explanations apply to Random Forest rather than the neural network. Tree SHAP used training sample counts stored in the fitted trees as its reference distribution. A reproducible random sample of 200 test records was explained. The baseline plus feature contributions reconstructed the corresponding Random Forest predictions, and the numerical verification passed.</w:t>
+      </w:r>
+    </w:p>
+    <w:p>
+      <w:r>
+        <w:br w:type="page"/>
+      </w:r>
+    </w:p>
+    <w:p>
+      <w:pPr>
+        <w:pStyle w:val="Heading2"/>
+      </w:pPr>
+      <w:r>
+        <w:lastRenderedPageBreak/>
+        <w:t>Global feature contributions</w:t>
+      </w:r>
+    </w:p>
+    <w:p>
+      <w:r>
+        <w:t xml:space="preserve">Time-of-day features had the largest mean absolute SHAP values in the sample. Hour cosine contributed 1438.3837 traffic-volume units on average in absolute magnitude, followed by hour at 447.4004 and hour sine at 204.0781. Day of week, weekday sine and the weekend flag also ranked highly. Individual weather features had smaller average contributions in this sample. </w:t>
+      </w:r>
+    </w:p>
+    <w:p>
+      <w:r>
+        <w:rPr>
+          <w:noProof/>
+        </w:rPr>
+        <w:drawing>
+          <wp:inline distT="0" distB="0" distL="0" distR="0" wp14:anchorId="0E49AD52" wp14:editId="3B8AE9E6">
+            <wp:extent cx="6035040" cy="3594997"/>
+            <wp:effectExtent l="0" t="0" r="0" b="0"/>
+            <wp:docPr id="15" name="Picture 15"/>
+            <wp:cNvGraphicFramePr>
+              <a:graphicFrameLocks xmlns:a="http://schemas.openxmlformats.org/drawingml/2006/main" noChangeAspect="1"/>
+            </wp:cNvGraphicFramePr>
+            <a:graphic xmlns:a="http://schemas.openxmlformats.org/drawingml/2006/main">
+              <a:graphicData uri="http://schemas.openxmlformats.org/drawingml/2006/picture">
+                <pic:pic xmlns:pic="http://schemas.openxmlformats.org/drawingml/2006/picture">
+                  <pic:nvPicPr>
+                    <pic:cNvPr id="0" name="shap_global_importance.png"/>
+                    <pic:cNvPicPr/>
+                  </pic:nvPicPr>
+                  <pic:blipFill>
+                    <a:blip r:embed="rId19"/>
+                    <a:stretch>
+                      <a:fillRect/>
+                    </a:stretch>
+                  </pic:blipFill>
+                  <pic:spPr>
+                    <a:xfrm>
+                      <a:off x="0" y="0"/>
+                      <a:ext cx="6035040" cy="3594997"/>
+                    </a:xfrm>
+                    <a:prstGeom prst="rect">
+                      <a:avLst/>
+                    </a:prstGeom>
+                  </pic:spPr>
+                </pic:pic>
+              </a:graphicData>
+            </a:graphic>
+          </wp:inline>
+        </w:drawing>
+      </w:r>
+      <w:r>
+        <w:br w:type="page"/>
+      </w:r>
+    </w:p>
+    <w:p>
+      <w:pPr>
+        <w:pStyle w:val="Heading2"/>
+      </w:pPr>
+      <w:r>
+        <w:lastRenderedPageBreak/>
+        <w:t>Local prediction explanation</w:t>
+      </w:r>
+    </w:p>
+    <w:p>
+      <w:r>
+        <w:t xml:space="preserve">For the sampled record at 18 April 2018 at 15:00, actual traffic volume was 5835 and Random Forest predicted 5801.5944. The SHAP baseline was 3244.9937 and the sum of contributions was 2556.6007. Their sum reconstructed the prediction. Hour cosine, hour and hour sine were the largest positive contributions. </w:t>
+      </w:r>
+    </w:p>
+    <w:p>
+      <w:r>
+        <w:rPr>
+          <w:noProof/>
+        </w:rPr>
+        <w:drawing>
+          <wp:inline distT="0" distB="0" distL="0" distR="0" wp14:anchorId="5B3BDE7E" wp14:editId="22D35B9F">
+            <wp:extent cx="6035040" cy="5559248"/>
+            <wp:effectExtent l="0" t="0" r="0" b="0"/>
+            <wp:docPr id="16" name="Picture 16"/>
+            <wp:cNvGraphicFramePr>
+              <a:graphicFrameLocks xmlns:a="http://schemas.openxmlformats.org/drawingml/2006/main" noChangeAspect="1"/>
+            </wp:cNvGraphicFramePr>
+            <a:graphic xmlns:a="http://schemas.openxmlformats.org/drawingml/2006/main">
+              <a:graphicData uri="http://schemas.openxmlformats.org/drawingml/2006/picture">
+                <pic:pic xmlns:pic="http://schemas.openxmlformats.org/drawingml/2006/picture">
+                  <pic:nvPicPr>
+                    <pic:cNvPr id="0" name="shap_local_waterfall.png"/>
+                    <pic:cNvPicPr/>
+                  </pic:nvPicPr>
+                  <pic:blipFill>
+                    <a:blip r:embed="rId20"/>
+                    <a:stretch>
+                      <a:fillRect/>
+                    </a:stretch>
+                  </pic:blipFill>
+                  <pic:spPr>
+                    <a:xfrm>
+                      <a:off x="0" y="0"/>
+                      <a:ext cx="6035040" cy="5559248"/>
+                    </a:xfrm>
+                    <a:prstGeom prst="rect">
+                      <a:avLst/>
+                    </a:prstGeom>
+                  </pic:spPr>
+                </pic:pic>
+              </a:graphicData>
+            </a:graphic>
+          </wp:inline>
+        </w:drawing>
+      </w:r>
+      <w:r>
+        <w:br w:type="page"/>
+      </w:r>
+    </w:p>
+    <w:p>
+      <w:pPr>
+        <w:pStyle w:val="Heading2"/>
+      </w:pPr>
+      <w:r>
+        <w:lastRenderedPageBreak/>
+        <w:t>Saved artifacts and reload verification</w:t>
+      </w:r>
+    </w:p>
+    <w:p>
+      <w:r>
+        <w:t>The network was saved as neural_network_traffic_v1.keras. The fitted preprocessor and configuration were saved as neural_network_preprocessor_v1.joblib and neural_network_config_v1.joblib. Configuration included the target scaling, feature list, imputation values, architecture, training settings, completed epochs and package versions.</w:t>
+      </w:r>
+    </w:p>
+    <w:p>
+      <w:r>
+        <w:rPr>
+          <w:noProof/>
+        </w:rPr>
+        <w:drawing>
+          <wp:inline distT="0" distB="0" distL="0" distR="0" wp14:anchorId="216EA00E" wp14:editId="2BFF02E4">
+            <wp:extent cx="6035040" cy="1377696"/>
+            <wp:effectExtent l="0" t="0" r="0" b="0"/>
+            <wp:docPr id="17" name="Picture 17"/>
+            <wp:cNvGraphicFramePr>
+              <a:graphicFrameLocks xmlns:a="http://schemas.openxmlformats.org/drawingml/2006/main" noChangeAspect="1"/>
+            </wp:cNvGraphicFramePr>
+            <a:graphic xmlns:a="http://schemas.openxmlformats.org/drawingml/2006/main">
+              <a:graphicData uri="http://schemas.openxmlformats.org/drawingml/2006/picture">
+                <pic:pic xmlns:pic="http://schemas.openxmlformats.org/drawingml/2006/picture">
+                  <pic:nvPicPr>
+                    <pic:cNvPr id="0" name="evidence_17.png"/>
+                    <pic:cNvPicPr/>
+                  </pic:nvPicPr>
+                  <pic:blipFill>
+                    <a:blip r:embed="rId21"/>
+                    <a:stretch>
+                      <a:fillRect/>
+                    </a:stretch>
+                  </pic:blipFill>
+                  <pic:spPr>
+                    <a:xfrm>
+                      <a:off x="0" y="0"/>
+                      <a:ext cx="6035040" cy="1377696"/>
                     </a:xfrm>
                     <a:prstGeom prst="rect">
                       <a:avLst/>
@@ -5031,6 +5469,12 @@
       <w:sz w:val="20"/>
     </w:rPr>
   </w:style>
+  <w:style w:type="paragraph" w:customStyle="1" w:styleId="Caption2">
+    <w:name w:val="Caption2"/>
+    <w:rPr>
+      <w:sz w:val="20"/>
+    </w:rPr>
+  </w:style>
 </w:styles>
 </file>
 

</xml_diff>

<commit_message>
Part 3 Task 4 Apply an Advanced AI Technique
</commit_message>
<xml_diff>
--- a/capstone_part3/Part3DEliverablesExecutionOutput.docx
+++ b/capstone_part3/Part3DEliverablesExecutionOutput.docx
@@ -35,29 +35,13 @@
         <w:t>10</w:t>
       </w:r>
       <w:r>
-        <w:t xml:space="preserve"> invalid temperature readings and </w:t>
-      </w:r>
-      <w:proofErr w:type="spellStart"/>
-      <w:r>
-        <w:t>on</w:t>
+        <w:t xml:space="preserve"> invalid temperature readings and on</w:t>
       </w:r>
       <w:r>
         <w:t xml:space="preserve"> </w:t>
       </w:r>
       <w:r>
-        <w:t>e</w:t>
-      </w:r>
-      <w:proofErr w:type="spellEnd"/>
-      <w:r>
-        <w:t xml:space="preserve"> invalid rainfall reading </w:t>
-      </w:r>
-      <w:proofErr w:type="spellStart"/>
-      <w:r>
-        <w:t>wre</w:t>
-      </w:r>
-      <w:proofErr w:type="spellEnd"/>
-      <w:r>
-        <w:t xml:space="preserve"> marked as missing</w:t>
+        <w:t>e invalid rainfall reading wre marked as missing</w:t>
       </w:r>
       <w:r>
         <w:t>.</w:t>
@@ -116,15 +100,7 @@
     </w:p>
     <w:p>
       <w:r>
-        <w:t xml:space="preserve">The split used 75 percent of unique timestamps for training, 15 percent for validation and 10 percent for testing. All records with the same timestamp stayed in one set. Training contained 35873 rows, validation 7370 and testing 4944. Missing temperature and rainfall values were filled using monthly medians </w:t>
-      </w:r>
-      <w:proofErr w:type="spellStart"/>
-      <w:r>
-        <w:t>calculatd</w:t>
-      </w:r>
-      <w:proofErr w:type="spellEnd"/>
-      <w:r>
-        <w:t xml:space="preserve"> from training data only, with training-wide medians as a fallback.</w:t>
+        <w:t>The split used 75 percent of unique timestamps for training, 15 percent for validation and 10 percent for testing. All records with the same timestamp stayed in one set. Training contained 35873 rows, validation 7370 and testing 4944. Missing temperature and rainfall values were filled using monthly medians calculatd from training data only, with training-wide medians as a fallback.</w:t>
       </w:r>
     </w:p>
     <w:p>
@@ -216,15 +192,7 @@
     </w:p>
     <w:p>
       <w:r>
-        <w:t xml:space="preserve">Training traffic-volume quartiles were 1175, 3349 and 4923. Values were categorised as Low, Medium, High or Severe. High risk required High or Severe </w:t>
-      </w:r>
-      <w:proofErr w:type="spellStart"/>
-      <w:r>
-        <w:t>trafic</w:t>
-      </w:r>
-      <w:proofErr w:type="spellEnd"/>
-      <w:r>
-        <w:t xml:space="preserve"> volume together with Snow, Thunderstorm or Squall, or low-visibility weather defined as Fog, Mist, Haze or Smoke. There were 3852 positive training labels, 1138 validation labels and 476 test labels. This proxy demonstrates classification and does not predict actual accidents. Weather is used in both the label definition and model inputs, which helps explain the strong classification scores.</w:t>
+        <w:t>Training traffic-volume quartiles were 1175, 3349 and 4923. Values were categorised as Low, Medium, High or Severe. High risk required High or Severe trafic volume together with Snow, Thunderstorm or Squall, or low-visibility weather defined as Fog, Mist, Haze or Smoke. There were 3852 positive training labels, 1138 validation labels and 476 test labels. This proxy demonstrates classification and does not predict actual accidents. Weather is used in both the label definition and model inputs, which helps explain the strong classification scores.</w:t>
       </w:r>
     </w:p>
     <w:p>
@@ -333,21 +301,12 @@
           <w:bCs/>
         </w:rPr>
       </w:pPr>
-      <w:proofErr w:type="spellStart"/>
       <w:r>
         <w:rPr>
           <w:b/>
           <w:bCs/>
         </w:rPr>
-        <w:t>lassification</w:t>
-      </w:r>
-      <w:proofErr w:type="spellEnd"/>
-      <w:r>
-        <w:rPr>
-          <w:b/>
-          <w:bCs/>
-        </w:rPr>
-        <w:t xml:space="preserve"> model comparison</w:t>
+        <w:t>lassification model comparison</w:t>
       </w:r>
     </w:p>
     <w:p>
@@ -474,31 +433,7 @@
     </w:p>
     <w:p>
       <w:r>
-        <w:t xml:space="preserve">Four model pipelines were saved as version 1 joblib files, together with preparation_config_v1.joblib. Four CSV </w:t>
-      </w:r>
-      <w:proofErr w:type="spellStart"/>
-      <w:r>
-        <w:t>fies</w:t>
-      </w:r>
-      <w:proofErr w:type="spellEnd"/>
-      <w:r>
-        <w:t xml:space="preserve"> record </w:t>
-      </w:r>
-      <w:proofErr w:type="spellStart"/>
-      <w:r>
-        <w:t>regresion</w:t>
-      </w:r>
-      <w:proofErr w:type="spellEnd"/>
-      <w:r>
-        <w:t xml:space="preserve"> and classification validation and test results. Reloaded models reproduced predictions and classifier </w:t>
-      </w:r>
-      <w:proofErr w:type="spellStart"/>
-      <w:r>
-        <w:t>probablities</w:t>
-      </w:r>
-      <w:proofErr w:type="spellEnd"/>
-      <w:r>
-        <w:t xml:space="preserve"> on 20 validation examples. </w:t>
+        <w:t xml:space="preserve">Four model pipelines were saved as version 1 joblib files, together with preparation_config_v1.joblib. Four CSV fies record regresion and classification validation and test results. Reloaded models reproduced predictions and classifier probablities on 20 validation examples. </w:t>
       </w:r>
     </w:p>
     <w:p>
@@ -780,39 +715,7 @@
     </w:p>
     <w:p>
       <w:r>
-        <w:t xml:space="preserve">Weekend nights with Mist had Low </w:t>
-      </w:r>
-      <w:proofErr w:type="spellStart"/>
-      <w:r>
-        <w:t>trafic</w:t>
-      </w:r>
-      <w:proofErr w:type="spellEnd"/>
-      <w:r>
-        <w:t xml:space="preserve"> volume in 511 of 558 matching records, giving confidence 91.6 percent, support 1.06 percent and lift 3.6630. Weekend nights overall had Low </w:t>
-      </w:r>
-      <w:proofErr w:type="spellStart"/>
-      <w:r>
-        <w:t>trffic</w:t>
-      </w:r>
-      <w:proofErr w:type="spellEnd"/>
-      <w:r>
-        <w:t xml:space="preserve"> volume in 3104 of 3503 records, </w:t>
-      </w:r>
-      <w:proofErr w:type="spellStart"/>
-      <w:r>
-        <w:t>conidence</w:t>
-      </w:r>
-      <w:proofErr w:type="spellEnd"/>
-      <w:r>
-        <w:t xml:space="preserve"> 88.6 percent and lift 3.5443. The </w:t>
-      </w:r>
-      <w:proofErr w:type="spellStart"/>
-      <w:r>
-        <w:t>nex</w:t>
-      </w:r>
-      <w:proofErr w:type="spellEnd"/>
-      <w:r>
-        <w:t xml:space="preserve"> rules were weekend nights with Clouds, nights with Snow, and weekend nights with Clear weather. </w:t>
+        <w:t xml:space="preserve">Weekend nights with Mist had Low trafic volume in 511 of 558 matching records, giving confidence 91.6 percent, support 1.06 percent and lift 3.6630. Weekend nights overall had Low trffic volume in 3104 of 3503 records, conidence 88.6 percent and lift 3.5443. The nex rules were weekend nights with Clouds, nights with Snow, and weekend nights with Clear weather. </w:t>
       </w:r>
     </w:p>
     <w:p>
@@ -957,29 +860,13 @@
     </w:p>
     <w:p>
       <w:r>
-        <w:t xml:space="preserve">The feedforward network used two hidden layers with 64 and 32 ReLU neurons and a single linear output. Training used Adam with learning </w:t>
-      </w:r>
-      <w:proofErr w:type="spellStart"/>
-      <w:r>
-        <w:t>ra</w:t>
+        <w:t>The feedforward network used two hidden layers with 64 and 32 ReLU neurons and a single linear output. Training used Adam with learning ra</w:t>
       </w:r>
       <w:r>
         <w:t>t</w:t>
       </w:r>
       <w:r>
-        <w:t>te</w:t>
-      </w:r>
-      <w:proofErr w:type="spellEnd"/>
-      <w:r>
-        <w:t xml:space="preserve"> 0.001, mean squared error loss and batch size 256. The </w:t>
-      </w:r>
-      <w:proofErr w:type="spellStart"/>
-      <w:r>
-        <w:t>trget</w:t>
-      </w:r>
-      <w:proofErr w:type="spellEnd"/>
-      <w:r>
-        <w:t xml:space="preserve"> was standardised using the training mean and standard deviation. Earl</w:t>
+        <w:t>te 0.001, mean squared error loss and batch size 256. The trget was standardised using the training mean and standard deviation. Earl</w:t>
       </w:r>
       <w:r>
         <w:t xml:space="preserve"> </w:t>
@@ -1301,6 +1188,257 @@
             </a:graphic>
           </wp:inline>
         </w:drawing>
+      </w:r>
+    </w:p>
+    <w:p>
+      <w:r>
+        <w:br w:type="page"/>
+      </w:r>
+    </w:p>
+    <w:p>
+      <w:pPr>
+        <w:pStyle w:val="Heading1"/>
+        <w:rPr>
+          <w:b/>
+          <w:bCs/>
+        </w:rPr>
+      </w:pPr>
+      <w:r>
+        <w:rPr>
+          <w:b/>
+          <w:bCs/>
+        </w:rPr>
+        <w:lastRenderedPageBreak/>
+        <w:t>Task 4 Apply an Advanced AI Technique</w:t>
+      </w:r>
+    </w:p>
+    <w:p>
+      <w:pPr>
+        <w:pStyle w:val="Heading2"/>
+      </w:pPr>
+      <w:r>
+        <w:t>MLflow experiment tracking</w:t>
+      </w:r>
+    </w:p>
+    <w:p>
+      <w:r>
+        <w:t xml:space="preserve">MLflow 3.17.0 imported successfully. Experiment tracking was used to record the existing Random Forest and neural network regression evaluations from Tasks 1 and 3. Each run retained model settings, version identifiers, validation and test metrics, and supporting artifacts. </w:t>
+      </w:r>
+    </w:p>
+    <w:p>
+      <w:pPr>
+        <w:pStyle w:val="Heading2"/>
+      </w:pPr>
+      <w:r>
+        <w:t>Local tracking configuration</w:t>
+      </w:r>
+    </w:p>
+    <w:p>
+      <w:r>
+        <w:rPr>
+          <w:noProof/>
+        </w:rPr>
+        <w:drawing>
+          <wp:inline distT="0" distB="0" distL="0" distR="0" wp14:anchorId="767B019E" wp14:editId="67F9FF22">
+            <wp:extent cx="6035040" cy="710944"/>
+            <wp:effectExtent l="0" t="0" r="0" b="0"/>
+            <wp:docPr id="18" name="Picture 18"/>
+            <wp:cNvGraphicFramePr>
+              <a:graphicFrameLocks xmlns:a="http://schemas.openxmlformats.org/drawingml/2006/main" noChangeAspect="1"/>
+            </wp:cNvGraphicFramePr>
+            <a:graphic xmlns:a="http://schemas.openxmlformats.org/drawingml/2006/main">
+              <a:graphicData uri="http://schemas.openxmlformats.org/drawingml/2006/picture">
+                <pic:pic xmlns:pic="http://schemas.openxmlformats.org/drawingml/2006/picture">
+                  <pic:nvPicPr>
+                    <pic:cNvPr id="0" name="evidence_18.png"/>
+                    <pic:cNvPicPr/>
+                  </pic:nvPicPr>
+                  <pic:blipFill>
+                    <a:blip r:embed="rId22"/>
+                    <a:stretch>
+                      <a:fillRect/>
+                    </a:stretch>
+                  </pic:blipFill>
+                  <pic:spPr>
+                    <a:xfrm>
+                      <a:off x="0" y="0"/>
+                      <a:ext cx="6035040" cy="710944"/>
+                    </a:xfrm>
+                    <a:prstGeom prst="rect">
+                      <a:avLst/>
+                    </a:prstGeom>
+                  </pic:spPr>
+                </pic:pic>
+              </a:graphicData>
+            </a:graphic>
+          </wp:inline>
+        </w:drawing>
+      </w:r>
+    </w:p>
+    <w:p>
+      <w:pPr>
+        <w:pStyle w:val="Heading2"/>
+      </w:pPr>
+      <w:r>
+        <w:t>Inputs and model settings</w:t>
+      </w:r>
+    </w:p>
+    <w:p>
+      <w:r>
+        <w:t xml:space="preserve">The Task 3 validation and test comparison CSV files loaded and joined by model name. Actual Random Forest settings read from the saved pipeline, and neural network settings read from its saved configuration. </w:t>
+      </w:r>
+    </w:p>
+    <w:p>
+      <w:pPr>
+        <w:pStyle w:val="Heading2"/>
+      </w:pPr>
+      <w:r>
+        <w:t>Recorded regression runs</w:t>
+      </w:r>
+    </w:p>
+    <w:p>
+      <w:r>
+        <w:rPr>
+          <w:noProof/>
+        </w:rPr>
+        <w:drawing>
+          <wp:inline distT="0" distB="0" distL="0" distR="0" wp14:anchorId="7CBDBB8D" wp14:editId="15D10843">
+            <wp:extent cx="6035040" cy="851688"/>
+            <wp:effectExtent l="0" t="0" r="0" b="0"/>
+            <wp:docPr id="19" name="Picture 19"/>
+            <wp:cNvGraphicFramePr>
+              <a:graphicFrameLocks xmlns:a="http://schemas.openxmlformats.org/drawingml/2006/main" noChangeAspect="1"/>
+            </wp:cNvGraphicFramePr>
+            <a:graphic xmlns:a="http://schemas.openxmlformats.org/drawingml/2006/main">
+              <a:graphicData uri="http://schemas.openxmlformats.org/drawingml/2006/picture">
+                <pic:pic xmlns:pic="http://schemas.openxmlformats.org/drawingml/2006/picture">
+                  <pic:nvPicPr>
+                    <pic:cNvPr id="0" name="evidence_19.png"/>
+                    <pic:cNvPicPr/>
+                  </pic:nvPicPr>
+                  <pic:blipFill>
+                    <a:blip r:embed="rId23"/>
+                    <a:stretch>
+                      <a:fillRect/>
+                    </a:stretch>
+                  </pic:blipFill>
+                  <pic:spPr>
+                    <a:xfrm>
+                      <a:off x="0" y="0"/>
+                      <a:ext cx="6035040" cy="851688"/>
+                    </a:xfrm>
+                    <a:prstGeom prst="rect">
+                      <a:avLst/>
+                    </a:prstGeom>
+                  </pic:spPr>
+                </pic:pic>
+              </a:graphicData>
+            </a:graphic>
+          </wp:inline>
+        </w:drawing>
+      </w:r>
+    </w:p>
+    <w:p>
+      <w:pPr>
+        <w:pStyle w:val="Heading2"/>
+      </w:pPr>
+      <w:r>
+        <w:t>Metrics and artifacts</w:t>
+      </w:r>
+    </w:p>
+    <w:p>
+      <w:r>
+        <w:t>Random Forest validation MAE was 317.5692 and R squared 0.9256; test MAE was 250.8358 and R squared 0.9448. Neural Net</w:t>
+      </w:r>
+      <w:r>
+        <w:t>t</w:t>
+      </w:r>
+      <w:r>
+        <w:t>work validation MAE was 316.4414 and R squared 0.9307; test MAE was 256.9366 and R squared 0.9455. Saved model files were logged as artifacts together with preparation settings, figures and readable evaluation JSON files. The neural network run also retained training history.</w:t>
+      </w:r>
+    </w:p>
+    <w:p>
+      <w:r>
+        <w:br w:type="page"/>
+      </w:r>
+    </w:p>
+    <w:p>
+      <w:pPr>
+        <w:pStyle w:val="Heading2"/>
+      </w:pPr>
+      <w:r>
+        <w:lastRenderedPageBreak/>
+        <w:t>Read back verification</w:t>
+      </w:r>
+    </w:p>
+    <w:p>
+      <w:r>
+        <w:t xml:space="preserve">Both runs retrieved through MlflowClient and had FINISHED status. Stored metrics matched the original results within numerical tolerance, and the model_version parameter was v1. </w:t>
+      </w:r>
+    </w:p>
+    <w:p>
+      <w:r>
+        <w:rPr>
+          <w:noProof/>
+        </w:rPr>
+        <w:drawing>
+          <wp:inline distT="0" distB="0" distL="0" distR="0" wp14:anchorId="0F36A585" wp14:editId="3E78951E">
+            <wp:extent cx="6035040" cy="2372196"/>
+            <wp:effectExtent l="0" t="0" r="0" b="0"/>
+            <wp:docPr id="20" name="Picture 20"/>
+            <wp:cNvGraphicFramePr>
+              <a:graphicFrameLocks xmlns:a="http://schemas.openxmlformats.org/drawingml/2006/main" noChangeAspect="1"/>
+            </wp:cNvGraphicFramePr>
+            <a:graphic xmlns:a="http://schemas.openxmlformats.org/drawingml/2006/main">
+              <a:graphicData uri="http://schemas.openxmlformats.org/drawingml/2006/picture">
+                <pic:pic xmlns:pic="http://schemas.openxmlformats.org/drawingml/2006/picture">
+                  <pic:nvPicPr>
+                    <pic:cNvPr id="0" name="evidence_20.png"/>
+                    <pic:cNvPicPr/>
+                  </pic:nvPicPr>
+                  <pic:blipFill>
+                    <a:blip r:embed="rId24"/>
+                    <a:stretch>
+                      <a:fillRect/>
+                    </a:stretch>
+                  </pic:blipFill>
+                  <pic:spPr>
+                    <a:xfrm>
+                      <a:off x="0" y="0"/>
+                      <a:ext cx="6035040" cy="2372196"/>
+                    </a:xfrm>
+                    <a:prstGeom prst="rect">
+                      <a:avLst/>
+                    </a:prstGeom>
+                  </pic:spPr>
+                </pic:pic>
+              </a:graphicData>
+            </a:graphic>
+          </wp:inline>
+        </w:drawing>
+      </w:r>
+    </w:p>
+    <w:p>
+      <w:pPr>
+        <w:pStyle w:val="Heading2"/>
+      </w:pPr>
+      <w:r>
+        <w:t>Value and limitations</w:t>
+      </w:r>
+    </w:p>
+    <w:p>
+      <w:r>
+        <w:t>MLflow brings the model settings, evaluation metrics and supporting artifacts together under identifiable runs. This makes the existing models easier to compare and supports later deployment and monitoring work.</w:t>
+      </w:r>
+    </w:p>
+    <w:p>
+      <w:r>
+        <w:t>Random Forest had slightly lower test MAE, while the neural network had slightly higher test R squared. Their results were close.</w:t>
+      </w:r>
+    </w:p>
+    <w:p>
+      <w:r>
+        <w:t>These runs record existing evaluations rather than new training experiments. Tracking does not improve model accuracy by itself. The artifact locations use local filesystem paths, so another computer may need tracking configuration changes.</w:t>
       </w:r>
     </w:p>
     <w:sectPr>

</xml_diff>

<commit_message>
Part 3 Task 5 Build a Traffic Recommendation System
</commit_message>
<xml_diff>
--- a/capstone_part3/Part3DEliverablesExecutionOutput.docx
+++ b/capstone_part3/Part3DEliverablesExecutionOutput.docx
@@ -1439,6 +1439,251 @@
     <w:p>
       <w:r>
         <w:t>These runs record existing evaluations rather than new training experiments. Tracking does not improve model accuracy by itself. The artifact locations use local filesystem paths, so another computer may need tracking configuration changes.</w:t>
+      </w:r>
+    </w:p>
+    <w:p>
+      <w:r>
+        <w:br w:type="page"/>
+      </w:r>
+    </w:p>
+    <w:p>
+      <w:pPr>
+        <w:pStyle w:val="Heading1"/>
+        <w:rPr>
+          <w:b/>
+          <w:bCs/>
+        </w:rPr>
+      </w:pPr>
+      <w:r>
+        <w:rPr>
+          <w:b/>
+          <w:bCs/>
+        </w:rPr>
+        <w:lastRenderedPageBreak/>
+        <w:t>Task 5 Build a Traffic Recommendation System</w:t>
+      </w:r>
+    </w:p>
+    <w:p>
+      <w:pPr>
+        <w:pStyle w:val="Heading2"/>
+      </w:pPr>
+      <w:r>
+        <w:t>Travel hour comparison</w:t>
+      </w:r>
+    </w:p>
+    <w:p>
+      <w:r>
+        <w:t>The saved Random Forest regression v1 model ranked supplied travel hours on one corridor by predicted hourly traffic volume. The system reused the saved preparation settings and 17 input features. The historical demonstration compared five hours on 07 May 2018 from 06:00 to 10:00, assuming clear weather, temperature 288.15 K, no rain or snow, zero cloud cover and no holiday.</w:t>
+      </w:r>
+    </w:p>
+    <w:p>
+      <w:r>
+        <w:rPr>
+          <w:noProof/>
+        </w:rPr>
+        <w:drawing>
+          <wp:inline distT="0" distB="0" distL="0" distR="0" wp14:anchorId="6DE724C7" wp14:editId="577AC8D3">
+            <wp:extent cx="6035040" cy="1782828"/>
+            <wp:effectExtent l="0" t="0" r="0" b="0"/>
+            <wp:docPr id="21" name="Picture 21"/>
+            <wp:cNvGraphicFramePr>
+              <a:graphicFrameLocks xmlns:a="http://schemas.openxmlformats.org/drawingml/2006/main" noChangeAspect="1"/>
+            </wp:cNvGraphicFramePr>
+            <a:graphic xmlns:a="http://schemas.openxmlformats.org/drawingml/2006/main">
+              <a:graphicData uri="http://schemas.openxmlformats.org/drawingml/2006/picture">
+                <pic:pic xmlns:pic="http://schemas.openxmlformats.org/drawingml/2006/picture">
+                  <pic:nvPicPr>
+                    <pic:cNvPr id="0" name="ranked_hours.png"/>
+                    <pic:cNvPicPr/>
+                  </pic:nvPicPr>
+                  <pic:blipFill>
+                    <a:blip r:embed="rId25"/>
+                    <a:stretch>
+                      <a:fillRect/>
+                    </a:stretch>
+                  </pic:blipFill>
+                  <pic:spPr>
+                    <a:xfrm>
+                      <a:off x="0" y="0"/>
+                      <a:ext cx="6035040" cy="1782828"/>
+                    </a:xfrm>
+                    <a:prstGeom prst="rect">
+                      <a:avLst/>
+                    </a:prstGeom>
+                  </pic:spPr>
+                </pic:pic>
+              </a:graphicData>
+            </a:graphic>
+          </wp:inline>
+        </w:drawing>
+      </w:r>
+    </w:p>
+    <w:p>
+      <w:r>
+        <w:br w:type="page"/>
+      </w:r>
+    </w:p>
+    <w:p>
+      <w:pPr>
+        <w:pStyle w:val="Heading2"/>
+      </w:pPr>
+      <w:r>
+        <w:lastRenderedPageBreak/>
+        <w:t>Input and ranking validation</w:t>
+      </w:r>
+    </w:p>
+    <w:p>
+      <w:r>
+        <w:t>The ranking retained every supplied candidate and sorted predicted volumes in ascending order. Shuffling input rows produced the same ranking. Validation rejected an unknown weather category, duplicate timestamps and cloud cover above 100. All three rejection checks passed, with full messages displayed.</w:t>
+      </w:r>
+    </w:p>
+    <w:p>
+      <w:r>
+        <w:rPr>
+          <w:noProof/>
+        </w:rPr>
+        <w:drawing>
+          <wp:inline distT="0" distB="0" distL="0" distR="0" wp14:anchorId="1C771B19" wp14:editId="20575CC2">
+            <wp:extent cx="6035040" cy="1159119"/>
+            <wp:effectExtent l="0" t="0" r="0" b="0"/>
+            <wp:docPr id="22" name="Picture 22"/>
+            <wp:cNvGraphicFramePr>
+              <a:graphicFrameLocks xmlns:a="http://schemas.openxmlformats.org/drawingml/2006/main" noChangeAspect="1"/>
+            </wp:cNvGraphicFramePr>
+            <a:graphic xmlns:a="http://schemas.openxmlformats.org/drawingml/2006/main">
+              <a:graphicData uri="http://schemas.openxmlformats.org/drawingml/2006/picture">
+                <pic:pic xmlns:pic="http://schemas.openxmlformats.org/drawingml/2006/picture">
+                  <pic:nvPicPr>
+                    <pic:cNvPr id="0" name="validation_checks.png"/>
+                    <pic:cNvPicPr/>
+                  </pic:nvPicPr>
+                  <pic:blipFill>
+                    <a:blip r:embed="rId26"/>
+                    <a:stretch>
+                      <a:fillRect/>
+                    </a:stretch>
+                  </pic:blipFill>
+                  <pic:spPr>
+                    <a:xfrm>
+                      <a:off x="0" y="0"/>
+                      <a:ext cx="6035040" cy="1159119"/>
+                    </a:xfrm>
+                    <a:prstGeom prst="rect">
+                      <a:avLst/>
+                    </a:prstGeom>
+                  </pic:spPr>
+                </pic:pic>
+              </a:graphicData>
+            </a:graphic>
+          </wp:inline>
+        </w:drawing>
+      </w:r>
+    </w:p>
+    <w:p>
+      <w:r>
+        <w:rPr>
+          <w:noProof/>
+        </w:rPr>
+        <w:drawing>
+          <wp:inline distT="0" distB="0" distL="0" distR="0" wp14:anchorId="528E4DAD" wp14:editId="3846BF76">
+            <wp:extent cx="6035040" cy="216728"/>
+            <wp:effectExtent l="0" t="0" r="0" b="0"/>
+            <wp:docPr id="23" name="Picture 23"/>
+            <wp:cNvGraphicFramePr>
+              <a:graphicFrameLocks xmlns:a="http://schemas.openxmlformats.org/drawingml/2006/main" noChangeAspect="1"/>
+            </wp:cNvGraphicFramePr>
+            <a:graphic xmlns:a="http://schemas.openxmlformats.org/drawingml/2006/main">
+              <a:graphicData uri="http://schemas.openxmlformats.org/drawingml/2006/picture">
+                <pic:pic xmlns:pic="http://schemas.openxmlformats.org/drawingml/2006/picture">
+                  <pic:nvPicPr>
+                    <pic:cNvPr id="0" name="saved_results.png"/>
+                    <pic:cNvPicPr/>
+                  </pic:nvPicPr>
+                  <pic:blipFill>
+                    <a:blip r:embed="rId27"/>
+                    <a:stretch>
+                      <a:fillRect/>
+                    </a:stretch>
+                  </pic:blipFill>
+                  <pic:spPr>
+                    <a:xfrm>
+                      <a:off x="0" y="0"/>
+                      <a:ext cx="6035040" cy="216728"/>
+                    </a:xfrm>
+                    <a:prstGeom prst="rect">
+                      <a:avLst/>
+                    </a:prstGeom>
+                  </pic:spPr>
+                </pic:pic>
+              </a:graphicData>
+            </a:graphic>
+          </wp:inline>
+        </w:drawing>
+      </w:r>
+    </w:p>
+    <w:p>
+      <w:r>
+        <w:t>Reusable recommendation module</w:t>
+      </w:r>
+    </w:p>
+    <w:p>
+      <w:r>
+        <w:t xml:space="preserve">The input preparation and travel window recommendation functions saved in recommendation_system/recommender.py. </w:t>
+      </w:r>
+    </w:p>
+    <w:p>
+      <w:r>
+        <w:rPr>
+          <w:noProof/>
+        </w:rPr>
+        <w:drawing>
+          <wp:inline distT="0" distB="0" distL="0" distR="0" wp14:anchorId="0D2BF500" wp14:editId="6A62C063">
+            <wp:extent cx="6035040" cy="3048000"/>
+            <wp:effectExtent l="0" t="0" r="0" b="0"/>
+            <wp:docPr id="24" name="Picture 24"/>
+            <wp:cNvGraphicFramePr>
+              <a:graphicFrameLocks xmlns:a="http://schemas.openxmlformats.org/drawingml/2006/main" noChangeAspect="1"/>
+            </wp:cNvGraphicFramePr>
+            <a:graphic xmlns:a="http://schemas.openxmlformats.org/drawingml/2006/main">
+              <a:graphicData uri="http://schemas.openxmlformats.org/drawingml/2006/picture">
+                <pic:pic xmlns:pic="http://schemas.openxmlformats.org/drawingml/2006/picture">
+                  <pic:nvPicPr>
+                    <pic:cNvPr id="0" name="module_verification.png"/>
+                    <pic:cNvPicPr/>
+                  </pic:nvPicPr>
+                  <pic:blipFill>
+                    <a:blip r:embed="rId28"/>
+                    <a:stretch>
+                      <a:fillRect/>
+                    </a:stretch>
+                  </pic:blipFill>
+                  <pic:spPr>
+                    <a:xfrm>
+                      <a:off x="0" y="0"/>
+                      <a:ext cx="6035040" cy="3048000"/>
+                    </a:xfrm>
+                    <a:prstGeom prst="rect">
+                      <a:avLst/>
+                    </a:prstGeom>
+                  </pic:spPr>
+                </pic:pic>
+              </a:graphicData>
+            </a:graphic>
+          </wp:inline>
+        </w:drawing>
+      </w:r>
+    </w:p>
+    <w:p>
+      <w:pPr>
+        <w:pStyle w:val="Heading2"/>
+      </w:pPr>
+      <w:r>
+        <w:t>Scope and limitations</w:t>
+      </w:r>
+    </w:p>
+    <w:p>
+      <w:r>
+        <w:t xml:space="preserve">The system compares only the supplied candidate hours on one corridor using stated weather and holiday assumptions. It does not compare routes, estimate journey time or provide live traffic information. </w:t>
       </w:r>
     </w:p>
     <w:sectPr>

</xml_diff>

<commit_message>
Part 3 Task 6 MLOps and Deployment Simulation
</commit_message>
<xml_diff>
--- a/capstone_part3/Part3DEliverablesExecutionOutput.docx
+++ b/capstone_part3/Part3DEliverablesExecutionOutput.docx
@@ -35,13 +35,29 @@
         <w:t>10</w:t>
       </w:r>
       <w:r>
-        <w:t xml:space="preserve"> invalid temperature readings and on</w:t>
+        <w:t xml:space="preserve"> invalid temperature readings and </w:t>
+      </w:r>
+      <w:proofErr w:type="spellStart"/>
+      <w:r>
+        <w:t>on</w:t>
       </w:r>
       <w:r>
         <w:t xml:space="preserve"> </w:t>
       </w:r>
       <w:r>
-        <w:t>e invalid rainfall reading wre marked as missing</w:t>
+        <w:t>e</w:t>
+      </w:r>
+      <w:proofErr w:type="spellEnd"/>
+      <w:r>
+        <w:t xml:space="preserve"> invalid rainfall reading </w:t>
+      </w:r>
+      <w:proofErr w:type="spellStart"/>
+      <w:r>
+        <w:t>wre</w:t>
+      </w:r>
+      <w:proofErr w:type="spellEnd"/>
+      <w:r>
+        <w:t xml:space="preserve"> marked as missing</w:t>
       </w:r>
       <w:r>
         <w:t>.</w:t>
@@ -100,7 +116,15 @@
     </w:p>
     <w:p>
       <w:r>
-        <w:t>The split used 75 percent of unique timestamps for training, 15 percent for validation and 10 percent for testing. All records with the same timestamp stayed in one set. Training contained 35873 rows, validation 7370 and testing 4944. Missing temperature and rainfall values were filled using monthly medians calculatd from training data only, with training-wide medians as a fallback.</w:t>
+        <w:t xml:space="preserve">The split used 75 percent of unique timestamps for training, 15 percent for validation and 10 percent for testing. All records with the same timestamp stayed in one set. Training contained 35873 rows, validation 7370 and testing 4944. Missing temperature and rainfall values were filled using monthly medians </w:t>
+      </w:r>
+      <w:proofErr w:type="spellStart"/>
+      <w:r>
+        <w:t>calculatd</w:t>
+      </w:r>
+      <w:proofErr w:type="spellEnd"/>
+      <w:r>
+        <w:t xml:space="preserve"> from training data only, with training-wide medians as a fallback.</w:t>
       </w:r>
     </w:p>
     <w:p>
@@ -192,7 +216,15 @@
     </w:p>
     <w:p>
       <w:r>
-        <w:t>Training traffic-volume quartiles were 1175, 3349 and 4923. Values were categorised as Low, Medium, High or Severe. High risk required High or Severe trafic volume together with Snow, Thunderstorm or Squall, or low-visibility weather defined as Fog, Mist, Haze or Smoke. There were 3852 positive training labels, 1138 validation labels and 476 test labels. This proxy demonstrates classification and does not predict actual accidents. Weather is used in both the label definition and model inputs, which helps explain the strong classification scores.</w:t>
+        <w:t xml:space="preserve">Training traffic-volume quartiles were 1175, 3349 and 4923. Values were categorised as Low, Medium, High or Severe. High risk required High or Severe </w:t>
+      </w:r>
+      <w:proofErr w:type="spellStart"/>
+      <w:r>
+        <w:t>trafic</w:t>
+      </w:r>
+      <w:proofErr w:type="spellEnd"/>
+      <w:r>
+        <w:t xml:space="preserve"> volume together with Snow, Thunderstorm or Squall, or low-visibility weather defined as Fog, Mist, Haze or Smoke. There were 3852 positive training labels, 1138 validation labels and 476 test labels. This proxy demonstrates classification and does not predict actual accidents. Weather is used in both the label definition and model inputs, which helps explain the strong classification scores.</w:t>
       </w:r>
     </w:p>
     <w:p>
@@ -301,12 +333,21 @@
           <w:bCs/>
         </w:rPr>
       </w:pPr>
+      <w:proofErr w:type="spellStart"/>
       <w:r>
         <w:rPr>
           <w:b/>
           <w:bCs/>
         </w:rPr>
-        <w:t>lassification model comparison</w:t>
+        <w:t>lassification</w:t>
+      </w:r>
+      <w:proofErr w:type="spellEnd"/>
+      <w:r>
+        <w:rPr>
+          <w:b/>
+          <w:bCs/>
+        </w:rPr>
+        <w:t xml:space="preserve"> model comparison</w:t>
       </w:r>
     </w:p>
     <w:p>
@@ -433,7 +474,47 @@
     </w:p>
     <w:p>
       <w:r>
-        <w:t xml:space="preserve">Four model pipelines were saved as version 1 joblib files, together with preparation_config_v1.joblib. Four CSV fies record regresion and classification validation and test results. Reloaded models reproduced predictions and classifier probablities on 20 validation examples. </w:t>
+        <w:t xml:space="preserve">Four model pipelines were saved as version 1 </w:t>
+      </w:r>
+      <w:proofErr w:type="spellStart"/>
+      <w:r>
+        <w:t>joblib</w:t>
+      </w:r>
+      <w:proofErr w:type="spellEnd"/>
+      <w:r>
+        <w:t xml:space="preserve"> files, together with preparation_config_v</w:t>
+      </w:r>
+      <w:proofErr w:type="gramStart"/>
+      <w:r>
+        <w:t>1.joblib</w:t>
+      </w:r>
+      <w:proofErr w:type="gramEnd"/>
+      <w:r>
+        <w:t xml:space="preserve">. Four CSV </w:t>
+      </w:r>
+      <w:proofErr w:type="spellStart"/>
+      <w:r>
+        <w:t>fies</w:t>
+      </w:r>
+      <w:proofErr w:type="spellEnd"/>
+      <w:r>
+        <w:t xml:space="preserve"> record </w:t>
+      </w:r>
+      <w:proofErr w:type="spellStart"/>
+      <w:r>
+        <w:t>regresion</w:t>
+      </w:r>
+      <w:proofErr w:type="spellEnd"/>
+      <w:r>
+        <w:t xml:space="preserve"> and classification validation and test results. Reloaded models reproduced predictions and classifier </w:t>
+      </w:r>
+      <w:proofErr w:type="spellStart"/>
+      <w:r>
+        <w:t>probablities</w:t>
+      </w:r>
+      <w:proofErr w:type="spellEnd"/>
+      <w:r>
+        <w:t xml:space="preserve"> on 20 validation examples. </w:t>
       </w:r>
     </w:p>
     <w:p>
@@ -715,7 +796,39 @@
     </w:p>
     <w:p>
       <w:r>
-        <w:t xml:space="preserve">Weekend nights with Mist had Low trafic volume in 511 of 558 matching records, giving confidence 91.6 percent, support 1.06 percent and lift 3.6630. Weekend nights overall had Low trffic volume in 3104 of 3503 records, conidence 88.6 percent and lift 3.5443. The nex rules were weekend nights with Clouds, nights with Snow, and weekend nights with Clear weather. </w:t>
+        <w:t xml:space="preserve">Weekend nights with Mist had Low </w:t>
+      </w:r>
+      <w:proofErr w:type="spellStart"/>
+      <w:r>
+        <w:t>trafic</w:t>
+      </w:r>
+      <w:proofErr w:type="spellEnd"/>
+      <w:r>
+        <w:t xml:space="preserve"> volume in 511 of 558 matching records, giving confidence 91.6 percent, support 1.06 percent and lift 3.6630. Weekend nights overall had Low </w:t>
+      </w:r>
+      <w:proofErr w:type="spellStart"/>
+      <w:r>
+        <w:t>trffic</w:t>
+      </w:r>
+      <w:proofErr w:type="spellEnd"/>
+      <w:r>
+        <w:t xml:space="preserve"> volume in 3104 of 3503 records, </w:t>
+      </w:r>
+      <w:proofErr w:type="spellStart"/>
+      <w:r>
+        <w:t>conidence</w:t>
+      </w:r>
+      <w:proofErr w:type="spellEnd"/>
+      <w:r>
+        <w:t xml:space="preserve"> 88.6 percent and lift 3.5443. The </w:t>
+      </w:r>
+      <w:proofErr w:type="spellStart"/>
+      <w:r>
+        <w:t>nex</w:t>
+      </w:r>
+      <w:proofErr w:type="spellEnd"/>
+      <w:r>
+        <w:t xml:space="preserve"> rules were weekend nights with Clouds, nights with Snow, and weekend nights with Clear weather. </w:t>
       </w:r>
     </w:p>
     <w:p>
@@ -860,13 +973,37 @@
     </w:p>
     <w:p>
       <w:r>
-        <w:t>The feedforward network used two hidden layers with 64 and 32 ReLU neurons and a single linear output. Training used Adam with learning ra</w:t>
+        <w:t xml:space="preserve">The feedforward network used two hidden layers with 64 and 32 </w:t>
+      </w:r>
+      <w:proofErr w:type="spellStart"/>
+      <w:r>
+        <w:t>ReLU</w:t>
+      </w:r>
+      <w:proofErr w:type="spellEnd"/>
+      <w:r>
+        <w:t xml:space="preserve"> neurons and a single linear output. Training used Adam with learning </w:t>
+      </w:r>
+      <w:proofErr w:type="spellStart"/>
+      <w:r>
+        <w:t>ra</w:t>
       </w:r>
       <w:r>
         <w:t>t</w:t>
       </w:r>
       <w:r>
-        <w:t>te 0.001, mean squared error loss and batch size 256. The trget was standardised using the training mean and standard deviation. Earl</w:t>
+        <w:t>te</w:t>
+      </w:r>
+      <w:proofErr w:type="spellEnd"/>
+      <w:r>
+        <w:t xml:space="preserve"> 0.001, mean squared error loss and batch size 256. The </w:t>
+      </w:r>
+      <w:proofErr w:type="spellStart"/>
+      <w:r>
+        <w:t>trget</w:t>
+      </w:r>
+      <w:proofErr w:type="spellEnd"/>
+      <w:r>
+        <w:t xml:space="preserve"> was standardised using the training mean and standard deviation. Earl</w:t>
       </w:r>
       <w:r>
         <w:t xml:space="preserve"> </w:t>
@@ -1145,7 +1282,31 @@
     </w:p>
     <w:p>
       <w:r>
-        <w:t>The network was saved as neural_network_traffic_v1.keras. The fitted preprocessor and configuration were saved as neural_network_preprocessor_v1.joblib and neural_network_config_v1.joblib. Configuration included the target scaling, feature list, imputation values, architecture, training settings, completed epochs and package versions.</w:t>
+        <w:t>The network was saved as neural_network_traffic_v</w:t>
+      </w:r>
+      <w:proofErr w:type="gramStart"/>
+      <w:r>
+        <w:t>1.keras</w:t>
+      </w:r>
+      <w:proofErr w:type="gramEnd"/>
+      <w:r>
+        <w:t>. The fitted preprocessor and configuration were saved as neural_network_preprocessor_v</w:t>
+      </w:r>
+      <w:proofErr w:type="gramStart"/>
+      <w:r>
+        <w:t>1.joblib</w:t>
+      </w:r>
+      <w:proofErr w:type="gramEnd"/>
+      <w:r>
+        <w:t xml:space="preserve"> and neural_network_config_v</w:t>
+      </w:r>
+      <w:proofErr w:type="gramStart"/>
+      <w:r>
+        <w:t>1.joblib</w:t>
+      </w:r>
+      <w:proofErr w:type="gramEnd"/>
+      <w:r>
+        <w:t>. Configuration included the target scaling, feature list, imputation values, architecture, training settings, completed epochs and package versions.</w:t>
       </w:r>
     </w:p>
     <w:p>
@@ -1216,13 +1377,23 @@
       <w:pPr>
         <w:pStyle w:val="Heading2"/>
       </w:pPr>
-      <w:r>
-        <w:t>MLflow experiment tracking</w:t>
-      </w:r>
-    </w:p>
-    <w:p>
-      <w:r>
-        <w:t xml:space="preserve">MLflow 3.17.0 imported successfully. Experiment tracking was used to record the existing Random Forest and neural network regression evaluations from Tasks 1 and 3. Each run retained model settings, version identifiers, validation and test metrics, and supporting artifacts. </w:t>
+      <w:proofErr w:type="spellStart"/>
+      <w:r>
+        <w:t>MLflow</w:t>
+      </w:r>
+      <w:proofErr w:type="spellEnd"/>
+      <w:r>
+        <w:t xml:space="preserve"> experiment tracking</w:t>
+      </w:r>
+    </w:p>
+    <w:p>
+      <w:proofErr w:type="spellStart"/>
+      <w:r>
+        <w:t>MLflow</w:t>
+      </w:r>
+      <w:proofErr w:type="spellEnd"/>
+      <w:r>
+        <w:t xml:space="preserve"> 3.17.0 imported successfully. Experiment tracking was used to record the existing Random Forest and neural network regression evaluations from Tasks 1 and 3. Each run retained model settings, version identifiers, validation and test metrics, and supporting artifacts. </w:t>
       </w:r>
     </w:p>
     <w:p>
@@ -1348,13 +1519,21 @@
     </w:p>
     <w:p>
       <w:r>
-        <w:t>Random Forest validation MAE was 317.5692 and R squared 0.9256; test MAE was 250.8358 and R squared 0.9448. Neural Net</w:t>
+        <w:t xml:space="preserve">Random Forest validation MAE was 317.5692 and R squared 0.9256; test MAE was 250.8358 and R squared 0.9448. Neural </w:t>
+      </w:r>
+      <w:proofErr w:type="spellStart"/>
+      <w:r>
+        <w:t>Net</w:t>
       </w:r>
       <w:r>
         <w:t>t</w:t>
       </w:r>
       <w:r>
-        <w:t>work validation MAE was 316.4414 and R squared 0.9307; test MAE was 256.9366 and R squared 0.9455. Saved model files were logged as artifacts together with preparation settings, figures and readable evaluation JSON files. The neural network run also retained training history.</w:t>
+        <w:t>work</w:t>
+      </w:r>
+      <w:proofErr w:type="spellEnd"/>
+      <w:r>
+        <w:t xml:space="preserve"> validation MAE was 316.4414 and R squared 0.9307; test MAE was 256.9366 and R squared 0.9455. Saved model files were logged as artifacts together with preparation settings, figures and readable evaluation JSON files. The neural network run also retained training history.</w:t>
       </w:r>
     </w:p>
     <w:p>
@@ -1373,7 +1552,23 @@
     </w:p>
     <w:p>
       <w:r>
-        <w:t xml:space="preserve">Both runs retrieved through MlflowClient and had FINISHED status. Stored metrics matched the original results within numerical tolerance, and the model_version parameter was v1. </w:t>
+        <w:t xml:space="preserve">Both runs retrieved through </w:t>
+      </w:r>
+      <w:proofErr w:type="spellStart"/>
+      <w:r>
+        <w:t>MlflowClient</w:t>
+      </w:r>
+      <w:proofErr w:type="spellEnd"/>
+      <w:r>
+        <w:t xml:space="preserve"> and had FINISHED status. Stored metrics matched the original results within numerical tolerance, and the </w:t>
+      </w:r>
+      <w:proofErr w:type="spellStart"/>
+      <w:r>
+        <w:t>model_version</w:t>
+      </w:r>
+      <w:proofErr w:type="spellEnd"/>
+      <w:r>
+        <w:t xml:space="preserve"> parameter was v1. </w:t>
       </w:r>
     </w:p>
     <w:p>
@@ -1427,8 +1622,13 @@
       </w:r>
     </w:p>
     <w:p>
-      <w:r>
-        <w:t>MLflow brings the model settings, evaluation metrics and supporting artifacts together under identifiable runs. This makes the existing models easier to compare and supports later deployment and monitoring work.</w:t>
+      <w:proofErr w:type="spellStart"/>
+      <w:r>
+        <w:t>MLflow</w:t>
+      </w:r>
+      <w:proofErr w:type="spellEnd"/>
+      <w:r>
+        <w:t xml:space="preserve"> brings the model settings, evaluation metrics and supporting artifacts together under identifiable runs. This makes the existing models easier to compare and supports later deployment and monitoring work.</w:t>
       </w:r>
     </w:p>
     <w:p>
@@ -1628,7 +1828,15 @@
     </w:p>
     <w:p>
       <w:r>
-        <w:t xml:space="preserve">The input preparation and travel window recommendation functions saved in recommendation_system/recommender.py. </w:t>
+        <w:t xml:space="preserve">The input preparation and travel window recommendation functions saved in </w:t>
+      </w:r>
+      <w:proofErr w:type="spellStart"/>
+      <w:r>
+        <w:t>recommendation_system</w:t>
+      </w:r>
+      <w:proofErr w:type="spellEnd"/>
+      <w:r>
+        <w:t xml:space="preserve">/recommender.py. </w:t>
       </w:r>
     </w:p>
     <w:p>
@@ -1684,6 +1892,560 @@
     <w:p>
       <w:r>
         <w:t xml:space="preserve">The system compares only the supplied candidate hours on one corridor using stated weather and holiday assumptions. It does not compare routes, estimate journey time or provide live traffic information. </w:t>
+      </w:r>
+    </w:p>
+    <w:p>
+      <w:r>
+        <w:br w:type="page"/>
+      </w:r>
+    </w:p>
+    <w:p>
+      <w:pPr>
+        <w:pStyle w:val="Heading1"/>
+        <w:rPr>
+          <w:b/>
+          <w:bCs/>
+        </w:rPr>
+      </w:pPr>
+      <w:r>
+        <w:rPr>
+          <w:b/>
+          <w:bCs/>
+        </w:rPr>
+        <w:lastRenderedPageBreak/>
+        <w:t xml:space="preserve">Task 6 </w:t>
+      </w:r>
+      <w:proofErr w:type="spellStart"/>
+      <w:r>
+        <w:rPr>
+          <w:b/>
+          <w:bCs/>
+        </w:rPr>
+        <w:t>MLOps</w:t>
+      </w:r>
+      <w:proofErr w:type="spellEnd"/>
+      <w:r>
+        <w:rPr>
+          <w:b/>
+          <w:bCs/>
+        </w:rPr>
+        <w:t xml:space="preserve"> and Deployment Simulation</w:t>
+      </w:r>
+    </w:p>
+    <w:p>
+      <w:pPr>
+        <w:pStyle w:val="Heading2"/>
+      </w:pPr>
+      <w:r>
+        <w:t>Model version and deployment manifest</w:t>
+      </w:r>
+    </w:p>
+    <w:p>
+      <w:r>
+        <w:rPr>
+          <w:noProof/>
+        </w:rPr>
+        <w:drawing>
+          <wp:inline distT="0" distB="0" distL="0" distR="0" wp14:anchorId="011719A0" wp14:editId="6E3ED09C">
+            <wp:extent cx="6035040" cy="547148"/>
+            <wp:effectExtent l="0" t="0" r="0" b="0"/>
+            <wp:docPr id="25" name="Picture 25"/>
+            <wp:cNvGraphicFramePr>
+              <a:graphicFrameLocks xmlns:a="http://schemas.openxmlformats.org/drawingml/2006/main" noChangeAspect="1"/>
+            </wp:cNvGraphicFramePr>
+            <a:graphic xmlns:a="http://schemas.openxmlformats.org/drawingml/2006/main">
+              <a:graphicData uri="http://schemas.openxmlformats.org/drawingml/2006/picture">
+                <pic:pic xmlns:pic="http://schemas.openxmlformats.org/drawingml/2006/picture">
+                  <pic:nvPicPr>
+                    <pic:cNvPr id="0" name="manifest.png"/>
+                    <pic:cNvPicPr/>
+                  </pic:nvPicPr>
+                  <pic:blipFill>
+                    <a:blip r:embed="rId29"/>
+                    <a:stretch>
+                      <a:fillRect/>
+                    </a:stretch>
+                  </pic:blipFill>
+                  <pic:spPr>
+                    <a:xfrm>
+                      <a:off x="0" y="0"/>
+                      <a:ext cx="6035040" cy="547148"/>
+                    </a:xfrm>
+                    <a:prstGeom prst="rect">
+                      <a:avLst/>
+                    </a:prstGeom>
+                  </pic:spPr>
+                </pic:pic>
+              </a:graphicData>
+            </a:graphic>
+          </wp:inline>
+        </w:drawing>
+      </w:r>
+    </w:p>
+    <w:p>
+      <w:r>
+        <w:t>Deployment manifest recorded model v1 and its evaluation metrics.</w:t>
+      </w:r>
+    </w:p>
+    <w:p>
+      <w:pPr>
+        <w:pStyle w:val="Heading2"/>
+      </w:pPr>
+      <w:r>
+        <w:t xml:space="preserve">API </w:t>
+      </w:r>
+      <w:proofErr w:type="spellStart"/>
+      <w:r>
+        <w:t>behavior</w:t>
+      </w:r>
+      <w:proofErr w:type="spellEnd"/>
+      <w:r>
+        <w:t xml:space="preserve"> and validation</w:t>
+      </w:r>
+    </w:p>
+    <w:p>
+      <w:r>
+        <w:rPr>
+          <w:noProof/>
+        </w:rPr>
+        <w:drawing>
+          <wp:inline distT="0" distB="0" distL="0" distR="0" wp14:anchorId="7AD5E76E" wp14:editId="7B1C6EF4">
+            <wp:extent cx="6035040" cy="2399607"/>
+            <wp:effectExtent l="0" t="0" r="0" b="0"/>
+            <wp:docPr id="26" name="Picture 26"/>
+            <wp:cNvGraphicFramePr>
+              <a:graphicFrameLocks xmlns:a="http://schemas.openxmlformats.org/drawingml/2006/main" noChangeAspect="1"/>
+            </wp:cNvGraphicFramePr>
+            <a:graphic xmlns:a="http://schemas.openxmlformats.org/drawingml/2006/main">
+              <a:graphicData uri="http://schemas.openxmlformats.org/drawingml/2006/picture">
+                <pic:pic xmlns:pic="http://schemas.openxmlformats.org/drawingml/2006/picture">
+                  <pic:nvPicPr>
+                    <pic:cNvPr id="0" name="api_checks.png"/>
+                    <pic:cNvPicPr/>
+                  </pic:nvPicPr>
+                  <pic:blipFill>
+                    <a:blip r:embed="rId30"/>
+                    <a:stretch>
+                      <a:fillRect/>
+                    </a:stretch>
+                  </pic:blipFill>
+                  <pic:spPr>
+                    <a:xfrm>
+                      <a:off x="0" y="0"/>
+                      <a:ext cx="6035040" cy="2399607"/>
+                    </a:xfrm>
+                    <a:prstGeom prst="rect">
+                      <a:avLst/>
+                    </a:prstGeom>
+                  </pic:spPr>
+                </pic:pic>
+              </a:graphicData>
+            </a:graphic>
+          </wp:inline>
+        </w:drawing>
+      </w:r>
+    </w:p>
+    <w:p>
+      <w:pPr>
+        <w:pStyle w:val="Heading2"/>
+      </w:pPr>
+      <w:r>
+        <w:t>Training reference and monitoring outcomes</w:t>
+      </w:r>
+    </w:p>
+    <w:p>
+      <w:r>
+        <w:rPr>
+          <w:noProof/>
+        </w:rPr>
+        <w:drawing>
+          <wp:inline distT="0" distB="0" distL="0" distR="0" wp14:anchorId="0CD97A8F" wp14:editId="0E3F736E">
+            <wp:extent cx="6035040" cy="1906962"/>
+            <wp:effectExtent l="0" t="0" r="0" b="0"/>
+            <wp:docPr id="27" name="Picture 27"/>
+            <wp:cNvGraphicFramePr>
+              <a:graphicFrameLocks xmlns:a="http://schemas.openxmlformats.org/drawingml/2006/main" noChangeAspect="1"/>
+            </wp:cNvGraphicFramePr>
+            <a:graphic xmlns:a="http://schemas.openxmlformats.org/drawingml/2006/main">
+              <a:graphicData uri="http://schemas.openxmlformats.org/drawingml/2006/picture">
+                <pic:pic xmlns:pic="http://schemas.openxmlformats.org/drawingml/2006/picture">
+                  <pic:nvPicPr>
+                    <pic:cNvPr id="0" name="monitoring.png"/>
+                    <pic:cNvPicPr/>
+                  </pic:nvPicPr>
+                  <pic:blipFill>
+                    <a:blip r:embed="rId31"/>
+                    <a:stretch>
+                      <a:fillRect/>
+                    </a:stretch>
+                  </pic:blipFill>
+                  <pic:spPr>
+                    <a:xfrm>
+                      <a:off x="0" y="0"/>
+                      <a:ext cx="6035040" cy="1906962"/>
+                    </a:xfrm>
+                    <a:prstGeom prst="rect">
+                      <a:avLst/>
+                    </a:prstGeom>
+                  </pic:spPr>
+                </pic:pic>
+              </a:graphicData>
+            </a:graphic>
+          </wp:inline>
+        </w:drawing>
+      </w:r>
+    </w:p>
+    <w:p>
+      <w:r>
+        <w:t>Synthetic batches produced the expected PASS and ALERT outcomes.</w:t>
+      </w:r>
+    </w:p>
+    <w:p>
+      <w:r>
+        <w:t>The five-record example batch was rejected with the message Monitoring requires at least 100 records. This prevented an insufficient batch from receiving PASS or ALERT.</w:t>
+      </w:r>
+    </w:p>
+    <w:p>
+      <w:r>
+        <w:rPr>
+          <w:noProof/>
+        </w:rPr>
+        <w:drawing>
+          <wp:inline distT="0" distB="0" distL="0" distR="0" wp14:anchorId="333BEE45" wp14:editId="1D30A675">
+            <wp:extent cx="6035040" cy="418870"/>
+            <wp:effectExtent l="0" t="0" r="0" b="0"/>
+            <wp:docPr id="28" name="Picture 28"/>
+            <wp:cNvGraphicFramePr>
+              <a:graphicFrameLocks xmlns:a="http://schemas.openxmlformats.org/drawingml/2006/main" noChangeAspect="1"/>
+            </wp:cNvGraphicFramePr>
+            <a:graphic xmlns:a="http://schemas.openxmlformats.org/drawingml/2006/main">
+              <a:graphicData uri="http://schemas.openxmlformats.org/drawingml/2006/picture">
+                <pic:pic xmlns:pic="http://schemas.openxmlformats.org/drawingml/2006/picture">
+                  <pic:nvPicPr>
+                    <pic:cNvPr id="0" name="minimum_batch.png"/>
+                    <pic:cNvPicPr/>
+                  </pic:nvPicPr>
+                  <pic:blipFill>
+                    <a:blip r:embed="rId32"/>
+                    <a:stretch>
+                      <a:fillRect/>
+                    </a:stretch>
+                  </pic:blipFill>
+                  <pic:spPr>
+                    <a:xfrm>
+                      <a:off x="0" y="0"/>
+                      <a:ext cx="6035040" cy="418870"/>
+                    </a:xfrm>
+                    <a:prstGeom prst="rect">
+                      <a:avLst/>
+                    </a:prstGeom>
+                  </pic:spPr>
+                </pic:pic>
+              </a:graphicData>
+            </a:graphic>
+          </wp:inline>
+        </w:drawing>
+      </w:r>
+    </w:p>
+    <w:p>
+      <w:r>
+        <w:br w:type="page"/>
+      </w:r>
+    </w:p>
+    <w:p>
+      <w:pPr>
+        <w:pStyle w:val="Heading2"/>
+      </w:pPr>
+      <w:r>
+        <w:t>Local server startup</w:t>
+      </w:r>
+    </w:p>
+    <w:p>
+      <w:r>
+        <w:drawing>
+          <wp:inline xmlns:a="http://schemas.openxmlformats.org/drawingml/2006/main" xmlns:pic="http://schemas.openxmlformats.org/drawingml/2006/picture">
+            <wp:extent cx="6035040" cy="592639"/>
+            <wp:docPr id="32" name="Picture 32"/>
+            <wp:cNvGraphicFramePr>
+              <a:graphicFrameLocks noChangeAspect="1"/>
+            </wp:cNvGraphicFramePr>
+            <a:graphic>
+              <a:graphicData uri="http://schemas.openxmlformats.org/drawingml/2006/picture">
+                <pic:pic>
+                  <pic:nvPicPr>
+                    <pic:cNvPr id="0" name="server_startup.png"/>
+                    <pic:cNvPicPr/>
+                  </pic:nvPicPr>
+                  <pic:blipFill>
+                    <a:blip r:embed="rId38"/>
+                    <a:stretch>
+                      <a:fillRect/>
+                    </a:stretch>
+                  </pic:blipFill>
+                  <pic:spPr>
+                    <a:xfrm>
+                      <a:off x="0" y="0"/>
+                      <a:ext cx="6035040" cy="592639"/>
+                    </a:xfrm>
+                    <a:prstGeom prst="rect"/>
+                  </pic:spPr>
+                </pic:pic>
+              </a:graphicData>
+            </a:graphic>
+          </wp:inline>
+        </w:drawing>
+      </w:r>
+    </w:p>
+    <w:p>
+      <w:r>
+        <w:t>The startup command launched Uvicorn successfully on 127.0.0.1 port 8000.</w:t>
+      </w:r>
+    </w:p>
+    <w:p>
+      <w:pPr>
+        <w:pStyle w:val="Heading2"/>
+      </w:pPr>
+      <w:r>
+        <w:lastRenderedPageBreak/>
+        <w:t>Reusable application and running server</w:t>
+      </w:r>
+    </w:p>
+    <w:p>
+      <w:r>
+        <w:t xml:space="preserve">The verified API and monitoring functions </w:t>
+      </w:r>
+      <w:r>
+        <w:t>are</w:t>
+      </w:r>
+      <w:r>
+        <w:t xml:space="preserve"> saved in deployment/app.py. It loads </w:t>
+      </w:r>
+      <w:proofErr w:type="spellStart"/>
+      <w:r>
+        <w:t>deployment_</w:t>
+      </w:r>
+      <w:proofErr w:type="gramStart"/>
+      <w:r>
+        <w:t>manifest.json</w:t>
+      </w:r>
+      <w:proofErr w:type="spellEnd"/>
+      <w:proofErr w:type="gramEnd"/>
+      <w:r>
+        <w:t xml:space="preserve"> and </w:t>
+      </w:r>
+      <w:proofErr w:type="spellStart"/>
+      <w:r>
+        <w:t>monitoring_</w:t>
+      </w:r>
+      <w:proofErr w:type="gramStart"/>
+      <w:r>
+        <w:t>reference.json</w:t>
+      </w:r>
+      <w:proofErr w:type="spellEnd"/>
+      <w:proofErr w:type="gramEnd"/>
+      <w:r>
+        <w:t>, v</w:t>
+      </w:r>
+      <w:r>
+        <w:t>e</w:t>
+      </w:r>
+      <w:r>
+        <w:t xml:space="preserve">rifies artifact hashes and locates the Task 5 feature preparation module relative to its </w:t>
+      </w:r>
+      <w:proofErr w:type="spellStart"/>
+      <w:r>
+        <w:t>o</w:t>
+      </w:r>
+      <w:r>
+        <w:t>o</w:t>
+      </w:r>
+      <w:r>
+        <w:t>wn</w:t>
+      </w:r>
+      <w:proofErr w:type="spellEnd"/>
+      <w:r>
+        <w:t xml:space="preserve"> location. Import checks reproduced API metadata and timestamps exactly, prediction values within tight tolerance, and both monitoring outcomes.</w:t>
+      </w:r>
+    </w:p>
+    <w:p>
+      <w:proofErr w:type="spellStart"/>
+      <w:r>
+        <w:t>Uvicorn</w:t>
+      </w:r>
+      <w:proofErr w:type="spellEnd"/>
+      <w:r>
+        <w:t xml:space="preserve"> served the application on 127.0.0.1 port 8000. Actual HTTP requests confirmed health and prediction responses with HTTP 200, preserved input order and matched direct inference. Invalid cloud cover returned HTTP 422. Verification tables and a live prediction response were saved.</w:t>
+      </w:r>
+    </w:p>
+    <w:p>
+      <w:r>
+        <w:rPr>
+          <w:noProof/>
+        </w:rPr>
+        <w:drawing>
+          <wp:inline distT="0" distB="0" distL="0" distR="0" wp14:anchorId="6E6EA4BA" wp14:editId="25B265B0">
+            <wp:extent cx="6035040" cy="2254184"/>
+            <wp:effectExtent l="0" t="0" r="0" b="0"/>
+            <wp:docPr id="29" name="Picture 29"/>
+            <wp:cNvGraphicFramePr>
+              <a:graphicFrameLocks xmlns:a="http://schemas.openxmlformats.org/drawingml/2006/main" noChangeAspect="1"/>
+            </wp:cNvGraphicFramePr>
+            <a:graphic xmlns:a="http://schemas.openxmlformats.org/drawingml/2006/main">
+              <a:graphicData uri="http://schemas.openxmlformats.org/drawingml/2006/picture">
+                <pic:pic xmlns:pic="http://schemas.openxmlformats.org/drawingml/2006/picture">
+                  <pic:nvPicPr>
+                    <pic:cNvPr id="0" name="live_http.png"/>
+                    <pic:cNvPicPr/>
+                  </pic:nvPicPr>
+                  <pic:blipFill>
+                    <a:blip r:embed="rId33"/>
+                    <a:stretch>
+                      <a:fillRect/>
+                    </a:stretch>
+                  </pic:blipFill>
+                  <pic:spPr>
+                    <a:xfrm>
+                      <a:off x="0" y="0"/>
+                      <a:ext cx="6035040" cy="2254184"/>
+                    </a:xfrm>
+                    <a:prstGeom prst="rect">
+                      <a:avLst/>
+                    </a:prstGeom>
+                  </pic:spPr>
+                </pic:pic>
+              </a:graphicData>
+            </a:graphic>
+          </wp:inline>
+        </w:drawing>
+      </w:r>
+    </w:p>
+    <w:p>
+      <w:r>
+        <w:t>The running local server passed health, prediction and validation checks</w:t>
+      </w:r>
+      <w:r>
+        <w:t>.</w:t>
+      </w:r>
+    </w:p>
+    <w:p>
+      <w:pPr>
+        <w:pStyle w:val="Heading2"/>
+      </w:pPr>
+      <w:r>
+        <w:t>Interactive browser tests</w:t>
+      </w:r>
+    </w:p>
+    <w:p>
+      <w:r>
+        <w:t>The interactive API documentation was used to submit one clear-weather record for 07 May 2018 at 10:00. The browser received HTTP 200, model version v1 and a prediction of approximately 4204.31 vehicles per hour. A second request set cloud cover to 150 and received HTTP 422 with a validation message requiring a value less than or equal to 100.</w:t>
+      </w:r>
+    </w:p>
+    <w:p>
+      <w:r>
+        <w:rPr>
+          <w:noProof/>
+        </w:rPr>
+        <w:drawing>
+          <wp:inline distT="0" distB="0" distL="0" distR="0" wp14:anchorId="47F3DCFD" wp14:editId="7171BDC2">
+            <wp:extent cx="6035040" cy="1123200"/>
+            <wp:effectExtent l="0" t="0" r="0" b="0"/>
+            <wp:docPr id="30" name="Picture 30"/>
+            <wp:cNvGraphicFramePr>
+              <a:graphicFrameLocks xmlns:a="http://schemas.openxmlformats.org/drawingml/2006/main" noChangeAspect="1"/>
+            </wp:cNvGraphicFramePr>
+            <a:graphic xmlns:a="http://schemas.openxmlformats.org/drawingml/2006/main">
+              <a:graphicData uri="http://schemas.openxmlformats.org/drawingml/2006/picture">
+                <pic:pic xmlns:pic="http://schemas.openxmlformats.org/drawingml/2006/picture">
+                  <pic:nvPicPr>
+                    <pic:cNvPr id="0" name="browser_valid.png"/>
+                    <pic:cNvPicPr/>
+                  </pic:nvPicPr>
+                  <pic:blipFill>
+                    <a:blip r:embed="rId34"/>
+                    <a:stretch>
+                      <a:fillRect/>
+                    </a:stretch>
+                  </pic:blipFill>
+                  <pic:spPr>
+                    <a:xfrm>
+                      <a:off x="0" y="0"/>
+                      <a:ext cx="6035040" cy="1123200"/>
+                    </a:xfrm>
+                    <a:prstGeom prst="rect">
+                      <a:avLst/>
+                    </a:prstGeom>
+                  </pic:spPr>
+                </pic:pic>
+              </a:graphicData>
+            </a:graphic>
+          </wp:inline>
+        </w:drawing>
+      </w:r>
+    </w:p>
+    <w:p>
+      <w:r>
+        <w:t>Browser request returned HTTP 200 and the expected traffic prediction.</w:t>
+      </w:r>
+    </w:p>
+    <w:p>
+      <w:r>
+        <w:rPr>
+          <w:noProof/>
+        </w:rPr>
+        <w:drawing>
+          <wp:inline distT="0" distB="0" distL="0" distR="0" wp14:anchorId="3389B23D" wp14:editId="4487A441">
+            <wp:extent cx="6035040" cy="1666945"/>
+            <wp:effectExtent l="0" t="0" r="0" b="0"/>
+            <wp:docPr id="31" name="Picture 31"/>
+            <wp:cNvGraphicFramePr>
+              <a:graphicFrameLocks xmlns:a="http://schemas.openxmlformats.org/drawingml/2006/main" noChangeAspect="1"/>
+            </wp:cNvGraphicFramePr>
+            <a:graphic xmlns:a="http://schemas.openxmlformats.org/drawingml/2006/main">
+              <a:graphicData uri="http://schemas.openxmlformats.org/drawingml/2006/picture">
+                <pic:pic xmlns:pic="http://schemas.openxmlformats.org/drawingml/2006/picture">
+                  <pic:nvPicPr>
+                    <pic:cNvPr id="0" name="browser_invalid.png"/>
+                    <pic:cNvPicPr/>
+                  </pic:nvPicPr>
+                  <pic:blipFill>
+                    <a:blip r:embed="rId35"/>
+                    <a:stretch>
+                      <a:fillRect/>
+                    </a:stretch>
+                  </pic:blipFill>
+                  <pic:spPr>
+                    <a:xfrm>
+                      <a:off x="0" y="0"/>
+                      <a:ext cx="6035040" cy="1666945"/>
+                    </a:xfrm>
+                    <a:prstGeom prst="rect">
+                      <a:avLst/>
+                    </a:prstGeom>
+                  </pic:spPr>
+                </pic:pic>
+              </a:graphicData>
+            </a:graphic>
+          </wp:inline>
+        </w:drawing>
+      </w:r>
+    </w:p>
+    <w:p>
+      <w:r>
+        <w:t>Browser validation rejected cloud cover 150 with HTTP 422.</w:t>
+      </w:r>
+    </w:p>
+    <w:p>
+      <w:pPr>
+        <w:pStyle w:val="Heading2"/>
+      </w:pPr>
+      <w:r>
+        <w:lastRenderedPageBreak/>
+        <w:t>Scope and limitations</w:t>
+      </w:r>
+    </w:p>
+    <w:p>
+      <w:r>
+        <w:t>This is a local deployment simulation using historical model artifacts. The monitoring threshold requires operational calibration. Mean checks do not detect every distribution change and PASS does not establish unchanged prediction accuracy. Accuracy monitoring requires observed traffic volumes. Feature monitoring is a Python function rather than an HTTP endpoint. The system does not provide live traffic information or journey times.</w:t>
       </w:r>
     </w:p>
     <w:sectPr>

</xml_diff>

<commit_message>
Part 3 Task 7 Responsible and Sustainable AI.
</commit_message>
<xml_diff>
--- a/capstone_part3/Part3DEliverablesExecutionOutput.docx
+++ b/capstone_part3/Part3DEliverablesExecutionOutput.docx
@@ -35,29 +35,13 @@
         <w:t>10</w:t>
       </w:r>
       <w:r>
-        <w:t xml:space="preserve"> invalid temperature readings and </w:t>
-      </w:r>
-      <w:proofErr w:type="spellStart"/>
-      <w:r>
-        <w:t>on</w:t>
+        <w:t xml:space="preserve"> invalid temperature readings and on</w:t>
       </w:r>
       <w:r>
         <w:t xml:space="preserve"> </w:t>
       </w:r>
       <w:r>
-        <w:t>e</w:t>
-      </w:r>
-      <w:proofErr w:type="spellEnd"/>
-      <w:r>
-        <w:t xml:space="preserve"> invalid rainfall reading </w:t>
-      </w:r>
-      <w:proofErr w:type="spellStart"/>
-      <w:r>
-        <w:t>wre</w:t>
-      </w:r>
-      <w:proofErr w:type="spellEnd"/>
-      <w:r>
-        <w:t xml:space="preserve"> marked as missing</w:t>
+        <w:t>e invalid rainfall reading wre marked as missing</w:t>
       </w:r>
       <w:r>
         <w:t>.</w:t>
@@ -116,15 +100,7 @@
     </w:p>
     <w:p>
       <w:r>
-        <w:t xml:space="preserve">The split used 75 percent of unique timestamps for training, 15 percent for validation and 10 percent for testing. All records with the same timestamp stayed in one set. Training contained 35873 rows, validation 7370 and testing 4944. Missing temperature and rainfall values were filled using monthly medians </w:t>
-      </w:r>
-      <w:proofErr w:type="spellStart"/>
-      <w:r>
-        <w:t>calculatd</w:t>
-      </w:r>
-      <w:proofErr w:type="spellEnd"/>
-      <w:r>
-        <w:t xml:space="preserve"> from training data only, with training-wide medians as a fallback.</w:t>
+        <w:t>The split used 75 percent of unique timestamps for training, 15 percent for validation and 10 percent for testing. All records with the same timestamp stayed in one set. Training contained 35873 rows, validation 7370 and testing 4944. Missing temperature and rainfall values were filled using monthly medians calculatd from training data only, with training-wide medians as a fallback.</w:t>
       </w:r>
     </w:p>
     <w:p>
@@ -216,15 +192,7 @@
     </w:p>
     <w:p>
       <w:r>
-        <w:t xml:space="preserve">Training traffic-volume quartiles were 1175, 3349 and 4923. Values were categorised as Low, Medium, High or Severe. High risk required High or Severe </w:t>
-      </w:r>
-      <w:proofErr w:type="spellStart"/>
-      <w:r>
-        <w:t>trafic</w:t>
-      </w:r>
-      <w:proofErr w:type="spellEnd"/>
-      <w:r>
-        <w:t xml:space="preserve"> volume together with Snow, Thunderstorm or Squall, or low-visibility weather defined as Fog, Mist, Haze or Smoke. There were 3852 positive training labels, 1138 validation labels and 476 test labels. This proxy demonstrates classification and does not predict actual accidents. Weather is used in both the label definition and model inputs, which helps explain the strong classification scores.</w:t>
+        <w:t>Training traffic-volume quartiles were 1175, 3349 and 4923. Values were categorised as Low, Medium, High or Severe. High risk required High or Severe trafic volume together with Snow, Thunderstorm or Squall, or low-visibility weather defined as Fog, Mist, Haze or Smoke. There were 3852 positive training labels, 1138 validation labels and 476 test labels. This proxy demonstrates classification and does not predict actual accidents. Weather is used in both the label definition and model inputs, which helps explain the strong classification scores.</w:t>
       </w:r>
     </w:p>
     <w:p>
@@ -333,21 +301,12 @@
           <w:bCs/>
         </w:rPr>
       </w:pPr>
-      <w:proofErr w:type="spellStart"/>
       <w:r>
         <w:rPr>
           <w:b/>
           <w:bCs/>
         </w:rPr>
-        <w:t>lassification</w:t>
-      </w:r>
-      <w:proofErr w:type="spellEnd"/>
-      <w:r>
-        <w:rPr>
-          <w:b/>
-          <w:bCs/>
-        </w:rPr>
-        <w:t xml:space="preserve"> model comparison</w:t>
+        <w:t>lassification model comparison</w:t>
       </w:r>
     </w:p>
     <w:p>
@@ -474,47 +433,7 @@
     </w:p>
     <w:p>
       <w:r>
-        <w:t xml:space="preserve">Four model pipelines were saved as version 1 </w:t>
-      </w:r>
-      <w:proofErr w:type="spellStart"/>
-      <w:r>
-        <w:t>joblib</w:t>
-      </w:r>
-      <w:proofErr w:type="spellEnd"/>
-      <w:r>
-        <w:t xml:space="preserve"> files, together with preparation_config_v</w:t>
-      </w:r>
-      <w:proofErr w:type="gramStart"/>
-      <w:r>
-        <w:t>1.joblib</w:t>
-      </w:r>
-      <w:proofErr w:type="gramEnd"/>
-      <w:r>
-        <w:t xml:space="preserve">. Four CSV </w:t>
-      </w:r>
-      <w:proofErr w:type="spellStart"/>
-      <w:r>
-        <w:t>fies</w:t>
-      </w:r>
-      <w:proofErr w:type="spellEnd"/>
-      <w:r>
-        <w:t xml:space="preserve"> record </w:t>
-      </w:r>
-      <w:proofErr w:type="spellStart"/>
-      <w:r>
-        <w:t>regresion</w:t>
-      </w:r>
-      <w:proofErr w:type="spellEnd"/>
-      <w:r>
-        <w:t xml:space="preserve"> and classification validation and test results. Reloaded models reproduced predictions and classifier </w:t>
-      </w:r>
-      <w:proofErr w:type="spellStart"/>
-      <w:r>
-        <w:t>probablities</w:t>
-      </w:r>
-      <w:proofErr w:type="spellEnd"/>
-      <w:r>
-        <w:t xml:space="preserve"> on 20 validation examples. </w:t>
+        <w:t xml:space="preserve">Four model pipelines were saved as version 1 joblib files, together with preparation_config_v1.joblib. Four CSV fies record regresion and classification validation and test results. Reloaded models reproduced predictions and classifier probablities on 20 validation examples. </w:t>
       </w:r>
     </w:p>
     <w:p>
@@ -796,39 +715,7 @@
     </w:p>
     <w:p>
       <w:r>
-        <w:t xml:space="preserve">Weekend nights with Mist had Low </w:t>
-      </w:r>
-      <w:proofErr w:type="spellStart"/>
-      <w:r>
-        <w:t>trafic</w:t>
-      </w:r>
-      <w:proofErr w:type="spellEnd"/>
-      <w:r>
-        <w:t xml:space="preserve"> volume in 511 of 558 matching records, giving confidence 91.6 percent, support 1.06 percent and lift 3.6630. Weekend nights overall had Low </w:t>
-      </w:r>
-      <w:proofErr w:type="spellStart"/>
-      <w:r>
-        <w:t>trffic</w:t>
-      </w:r>
-      <w:proofErr w:type="spellEnd"/>
-      <w:r>
-        <w:t xml:space="preserve"> volume in 3104 of 3503 records, </w:t>
-      </w:r>
-      <w:proofErr w:type="spellStart"/>
-      <w:r>
-        <w:t>conidence</w:t>
-      </w:r>
-      <w:proofErr w:type="spellEnd"/>
-      <w:r>
-        <w:t xml:space="preserve"> 88.6 percent and lift 3.5443. The </w:t>
-      </w:r>
-      <w:proofErr w:type="spellStart"/>
-      <w:r>
-        <w:t>nex</w:t>
-      </w:r>
-      <w:proofErr w:type="spellEnd"/>
-      <w:r>
-        <w:t xml:space="preserve"> rules were weekend nights with Clouds, nights with Snow, and weekend nights with Clear weather. </w:t>
+        <w:t xml:space="preserve">Weekend nights with Mist had Low trafic volume in 511 of 558 matching records, giving confidence 91.6 percent, support 1.06 percent and lift 3.6630. Weekend nights overall had Low trffic volume in 3104 of 3503 records, conidence 88.6 percent and lift 3.5443. The nex rules were weekend nights with Clouds, nights with Snow, and weekend nights with Clear weather. </w:t>
       </w:r>
     </w:p>
     <w:p>
@@ -973,37 +860,13 @@
     </w:p>
     <w:p>
       <w:r>
-        <w:t xml:space="preserve">The feedforward network used two hidden layers with 64 and 32 </w:t>
-      </w:r>
-      <w:proofErr w:type="spellStart"/>
-      <w:r>
-        <w:t>ReLU</w:t>
-      </w:r>
-      <w:proofErr w:type="spellEnd"/>
-      <w:r>
-        <w:t xml:space="preserve"> neurons and a single linear output. Training used Adam with learning </w:t>
-      </w:r>
-      <w:proofErr w:type="spellStart"/>
-      <w:r>
-        <w:t>ra</w:t>
+        <w:t>The feedforward network used two hidden layers with 64 and 32 ReLU neurons and a single linear output. Training used Adam with learning ra</w:t>
       </w:r>
       <w:r>
         <w:t>t</w:t>
       </w:r>
       <w:r>
-        <w:t>te</w:t>
-      </w:r>
-      <w:proofErr w:type="spellEnd"/>
-      <w:r>
-        <w:t xml:space="preserve"> 0.001, mean squared error loss and batch size 256. The </w:t>
-      </w:r>
-      <w:proofErr w:type="spellStart"/>
-      <w:r>
-        <w:t>trget</w:t>
-      </w:r>
-      <w:proofErr w:type="spellEnd"/>
-      <w:r>
-        <w:t xml:space="preserve"> was standardised using the training mean and standard deviation. Earl</w:t>
+        <w:t>te 0.001, mean squared error loss and batch size 256. The trget was standardised using the training mean and standard deviation. Earl</w:t>
       </w:r>
       <w:r>
         <w:t xml:space="preserve"> </w:t>
@@ -1282,31 +1145,7 @@
     </w:p>
     <w:p>
       <w:r>
-        <w:t>The network was saved as neural_network_traffic_v</w:t>
-      </w:r>
-      <w:proofErr w:type="gramStart"/>
-      <w:r>
-        <w:t>1.keras</w:t>
-      </w:r>
-      <w:proofErr w:type="gramEnd"/>
-      <w:r>
-        <w:t>. The fitted preprocessor and configuration were saved as neural_network_preprocessor_v</w:t>
-      </w:r>
-      <w:proofErr w:type="gramStart"/>
-      <w:r>
-        <w:t>1.joblib</w:t>
-      </w:r>
-      <w:proofErr w:type="gramEnd"/>
-      <w:r>
-        <w:t xml:space="preserve"> and neural_network_config_v</w:t>
-      </w:r>
-      <w:proofErr w:type="gramStart"/>
-      <w:r>
-        <w:t>1.joblib</w:t>
-      </w:r>
-      <w:proofErr w:type="gramEnd"/>
-      <w:r>
-        <w:t>. Configuration included the target scaling, feature list, imputation values, architecture, training settings, completed epochs and package versions.</w:t>
+        <w:t>The network was saved as neural_network_traffic_v1.keras. The fitted preprocessor and configuration were saved as neural_network_preprocessor_v1.joblib and neural_network_config_v1.joblib. Configuration included the target scaling, feature list, imputation values, architecture, training settings, completed epochs and package versions.</w:t>
       </w:r>
     </w:p>
     <w:p>
@@ -1377,23 +1216,13 @@
       <w:pPr>
         <w:pStyle w:val="Heading2"/>
       </w:pPr>
-      <w:proofErr w:type="spellStart"/>
-      <w:r>
-        <w:t>MLflow</w:t>
-      </w:r>
-      <w:proofErr w:type="spellEnd"/>
-      <w:r>
-        <w:t xml:space="preserve"> experiment tracking</w:t>
-      </w:r>
-    </w:p>
-    <w:p>
-      <w:proofErr w:type="spellStart"/>
-      <w:r>
-        <w:t>MLflow</w:t>
-      </w:r>
-      <w:proofErr w:type="spellEnd"/>
-      <w:r>
-        <w:t xml:space="preserve"> 3.17.0 imported successfully. Experiment tracking was used to record the existing Random Forest and neural network regression evaluations from Tasks 1 and 3. Each run retained model settings, version identifiers, validation and test metrics, and supporting artifacts. </w:t>
+      <w:r>
+        <w:t>MLflow experiment tracking</w:t>
+      </w:r>
+    </w:p>
+    <w:p>
+      <w:r>
+        <w:t xml:space="preserve">MLflow 3.17.0 imported successfully. Experiment tracking was used to record the existing Random Forest and neural network regression evaluations from Tasks 1 and 3. Each run retained model settings, version identifiers, validation and test metrics, and supporting artifacts. </w:t>
       </w:r>
     </w:p>
     <w:p>
@@ -1519,21 +1348,13 @@
     </w:p>
     <w:p>
       <w:r>
-        <w:t xml:space="preserve">Random Forest validation MAE was 317.5692 and R squared 0.9256; test MAE was 250.8358 and R squared 0.9448. Neural </w:t>
-      </w:r>
-      <w:proofErr w:type="spellStart"/>
-      <w:r>
-        <w:t>Net</w:t>
+        <w:t>Random Forest validation MAE was 317.5692 and R squared 0.9256; test MAE was 250.8358 and R squared 0.9448. Neural Net</w:t>
       </w:r>
       <w:r>
         <w:t>t</w:t>
       </w:r>
       <w:r>
-        <w:t>work</w:t>
-      </w:r>
-      <w:proofErr w:type="spellEnd"/>
-      <w:r>
-        <w:t xml:space="preserve"> validation MAE was 316.4414 and R squared 0.9307; test MAE was 256.9366 and R squared 0.9455. Saved model files were logged as artifacts together with preparation settings, figures and readable evaluation JSON files. The neural network run also retained training history.</w:t>
+        <w:t>work validation MAE was 316.4414 and R squared 0.9307; test MAE was 256.9366 and R squared 0.9455. Saved model files were logged as artifacts together with preparation settings, figures and readable evaluation JSON files. The neural network run also retained training history.</w:t>
       </w:r>
     </w:p>
     <w:p>
@@ -1552,23 +1373,7 @@
     </w:p>
     <w:p>
       <w:r>
-        <w:t xml:space="preserve">Both runs retrieved through </w:t>
-      </w:r>
-      <w:proofErr w:type="spellStart"/>
-      <w:r>
-        <w:t>MlflowClient</w:t>
-      </w:r>
-      <w:proofErr w:type="spellEnd"/>
-      <w:r>
-        <w:t xml:space="preserve"> and had FINISHED status. Stored metrics matched the original results within numerical tolerance, and the </w:t>
-      </w:r>
-      <w:proofErr w:type="spellStart"/>
-      <w:r>
-        <w:t>model_version</w:t>
-      </w:r>
-      <w:proofErr w:type="spellEnd"/>
-      <w:r>
-        <w:t xml:space="preserve"> parameter was v1. </w:t>
+        <w:t xml:space="preserve">Both runs retrieved through MlflowClient and had FINISHED status. Stored metrics matched the original results within numerical tolerance, and the model_version parameter was v1. </w:t>
       </w:r>
     </w:p>
     <w:p>
@@ -1622,13 +1427,8 @@
       </w:r>
     </w:p>
     <w:p>
-      <w:proofErr w:type="spellStart"/>
-      <w:r>
-        <w:t>MLflow</w:t>
-      </w:r>
-      <w:proofErr w:type="spellEnd"/>
-      <w:r>
-        <w:t xml:space="preserve"> brings the model settings, evaluation metrics and supporting artifacts together under identifiable runs. This makes the existing models easier to compare and supports later deployment and monitoring work.</w:t>
+      <w:r>
+        <w:t>MLflow brings the model settings, evaluation metrics and supporting artifacts together under identifiable runs. This makes the existing models easier to compare and supports later deployment and monitoring work.</w:t>
       </w:r>
     </w:p>
     <w:p>
@@ -1828,15 +1628,7 @@
     </w:p>
     <w:p>
       <w:r>
-        <w:t xml:space="preserve">The input preparation and travel window recommendation functions saved in </w:t>
-      </w:r>
-      <w:proofErr w:type="spellStart"/>
-      <w:r>
-        <w:t>recommendation_system</w:t>
-      </w:r>
-      <w:proofErr w:type="spellEnd"/>
-      <w:r>
-        <w:t xml:space="preserve">/recommender.py. </w:t>
+        <w:t xml:space="preserve">The input preparation and travel window recommendation functions saved in recommendation_system/recommender.py. </w:t>
       </w:r>
     </w:p>
     <w:p>
@@ -1913,23 +1705,7 @@
           <w:bCs/>
         </w:rPr>
         <w:lastRenderedPageBreak/>
-        <w:t xml:space="preserve">Task 6 </w:t>
-      </w:r>
-      <w:proofErr w:type="spellStart"/>
-      <w:r>
-        <w:rPr>
-          <w:b/>
-          <w:bCs/>
-        </w:rPr>
-        <w:t>MLOps</w:t>
-      </w:r>
-      <w:proofErr w:type="spellEnd"/>
-      <w:r>
-        <w:rPr>
-          <w:b/>
-          <w:bCs/>
-        </w:rPr>
-        <w:t xml:space="preserve"> and Deployment Simulation</w:t>
+        <w:t>Task 6 MLOps and Deployment Simulation</w:t>
       </w:r>
     </w:p>
     <w:p>
@@ -1992,15 +1768,7 @@
         <w:pStyle w:val="Heading2"/>
       </w:pPr>
       <w:r>
-        <w:t xml:space="preserve">API </w:t>
-      </w:r>
-      <w:proofErr w:type="spellStart"/>
-      <w:r>
-        <w:t>behavior</w:t>
-      </w:r>
-      <w:proofErr w:type="spellEnd"/>
-      <w:r>
-        <w:t xml:space="preserve"> and validation</w:t>
+        <w:t>API behavior and validation</w:t>
       </w:r>
     </w:p>
     <w:p>
@@ -2157,27 +1925,32 @@
         <w:pStyle w:val="Heading2"/>
       </w:pPr>
       <w:r>
+        <w:lastRenderedPageBreak/>
         <w:t>Local server startup</w:t>
       </w:r>
     </w:p>
     <w:p>
       <w:r>
+        <w:rPr>
+          <w:noProof/>
+        </w:rPr>
         <w:drawing>
-          <wp:inline xmlns:a="http://schemas.openxmlformats.org/drawingml/2006/main" xmlns:pic="http://schemas.openxmlformats.org/drawingml/2006/picture">
+          <wp:inline distT="0" distB="0" distL="0" distR="0" wp14:anchorId="14ABA842" wp14:editId="1862A932">
             <wp:extent cx="6035040" cy="592639"/>
+            <wp:effectExtent l="0" t="0" r="0" b="0"/>
             <wp:docPr id="32" name="Picture 32"/>
             <wp:cNvGraphicFramePr>
-              <a:graphicFrameLocks noChangeAspect="1"/>
+              <a:graphicFrameLocks xmlns:a="http://schemas.openxmlformats.org/drawingml/2006/main" noChangeAspect="1"/>
             </wp:cNvGraphicFramePr>
-            <a:graphic>
+            <a:graphic xmlns:a="http://schemas.openxmlformats.org/drawingml/2006/main">
               <a:graphicData uri="http://schemas.openxmlformats.org/drawingml/2006/picture">
-                <pic:pic>
+                <pic:pic xmlns:pic="http://schemas.openxmlformats.org/drawingml/2006/picture">
                   <pic:nvPicPr>
                     <pic:cNvPr id="0" name="server_startup.png"/>
                     <pic:cNvPicPr/>
                   </pic:nvPicPr>
                   <pic:blipFill>
-                    <a:blip r:embed="rId38"/>
+                    <a:blip r:embed="rId33"/>
                     <a:stretch>
                       <a:fillRect/>
                     </a:stretch>
@@ -2187,7 +1960,9 @@
                       <a:off x="0" y="0"/>
                       <a:ext cx="6035040" cy="592639"/>
                     </a:xfrm>
-                    <a:prstGeom prst="rect"/>
+                    <a:prstGeom prst="rect">
+                      <a:avLst/>
+                    </a:prstGeom>
                   </pic:spPr>
                 </pic:pic>
               </a:graphicData>
@@ -2206,7 +1981,6 @@
         <w:pStyle w:val="Heading2"/>
       </w:pPr>
       <w:r>
-        <w:lastRenderedPageBreak/>
         <w:t>Reusable application and running server</w:t>
       </w:r>
     </w:p>
@@ -2218,63 +1992,24 @@
         <w:t>are</w:t>
       </w:r>
       <w:r>
-        <w:t xml:space="preserve"> saved in deployment/app.py. It loads </w:t>
-      </w:r>
-      <w:proofErr w:type="spellStart"/>
-      <w:r>
-        <w:t>deployment_</w:t>
-      </w:r>
-      <w:proofErr w:type="gramStart"/>
-      <w:r>
-        <w:t>manifest.json</w:t>
-      </w:r>
-      <w:proofErr w:type="spellEnd"/>
-      <w:proofErr w:type="gramEnd"/>
-      <w:r>
-        <w:t xml:space="preserve"> and </w:t>
-      </w:r>
-      <w:proofErr w:type="spellStart"/>
-      <w:r>
-        <w:t>monitoring_</w:t>
-      </w:r>
-      <w:proofErr w:type="gramStart"/>
-      <w:r>
-        <w:t>reference.json</w:t>
-      </w:r>
-      <w:proofErr w:type="spellEnd"/>
-      <w:proofErr w:type="gramEnd"/>
-      <w:r>
-        <w:t>, v</w:t>
+        <w:t xml:space="preserve"> saved in deployment/app.py. It loads deployment_manifest.json and monitoring_reference.json, v</w:t>
       </w:r>
       <w:r>
         <w:t>e</w:t>
       </w:r>
       <w:r>
-        <w:t xml:space="preserve">rifies artifact hashes and locates the Task 5 feature preparation module relative to its </w:t>
-      </w:r>
-      <w:proofErr w:type="spellStart"/>
+        <w:t>rifies artifact hashes and locates the Task 5 feature preparation module relative to its o</w:t>
+      </w:r>
       <w:r>
         <w:t>o</w:t>
       </w:r>
       <w:r>
-        <w:t>o</w:t>
-      </w:r>
-      <w:r>
-        <w:t>wn</w:t>
-      </w:r>
-      <w:proofErr w:type="spellEnd"/>
-      <w:r>
-        <w:t xml:space="preserve"> location. Import checks reproduced API metadata and timestamps exactly, prediction values within tight tolerance, and both monitoring outcomes.</w:t>
-      </w:r>
-    </w:p>
-    <w:p>
-      <w:proofErr w:type="spellStart"/>
-      <w:r>
-        <w:t>Uvicorn</w:t>
-      </w:r>
-      <w:proofErr w:type="spellEnd"/>
-      <w:r>
-        <w:t xml:space="preserve"> served the application on 127.0.0.1 port 8000. Actual HTTP requests confirmed health and prediction responses with HTTP 200, preserved input order and matched direct inference. Invalid cloud cover returned HTTP 422. Verification tables and a live prediction response were saved.</w:t>
+        <w:t>wn location. Import checks reproduced API metadata and timestamps exactly, prediction values within tight tolerance, and both monitoring outcomes.</w:t>
+      </w:r>
+    </w:p>
+    <w:p>
+      <w:r>
+        <w:t>Uvicorn served the application on 127.0.0.1 port 8000. Actual HTTP requests confirmed health and prediction responses with HTTP 200, preserved input order and matched direct inference. Invalid cloud cover returned HTTP 422. Verification tables and a live prediction response were saved.</w:t>
       </w:r>
     </w:p>
     <w:p>
@@ -2298,7 +2033,7 @@
                     <pic:cNvPicPr/>
                   </pic:nvPicPr>
                   <pic:blipFill>
-                    <a:blip r:embed="rId33"/>
+                    <a:blip r:embed="rId34"/>
                     <a:stretch>
                       <a:fillRect/>
                     </a:stretch>
@@ -2361,7 +2096,7 @@
                     <pic:cNvPicPr/>
                   </pic:nvPicPr>
                   <pic:blipFill>
-                    <a:blip r:embed="rId34"/>
+                    <a:blip r:embed="rId35"/>
                     <a:stretch>
                       <a:fillRect/>
                     </a:stretch>
@@ -2392,6 +2127,7 @@
         <w:rPr>
           <w:noProof/>
         </w:rPr>
+        <w:lastRenderedPageBreak/>
         <w:drawing>
           <wp:inline distT="0" distB="0" distL="0" distR="0" wp14:anchorId="3389B23D" wp14:editId="4487A441">
             <wp:extent cx="6035040" cy="1666945"/>
@@ -2408,7 +2144,7 @@
                     <pic:cNvPicPr/>
                   </pic:nvPicPr>
                   <pic:blipFill>
-                    <a:blip r:embed="rId35"/>
+                    <a:blip r:embed="rId36"/>
                     <a:stretch>
                       <a:fillRect/>
                     </a:stretch>
@@ -2439,13 +2175,357 @@
         <w:pStyle w:val="Heading2"/>
       </w:pPr>
       <w:r>
+        <w:t>Scope and limitations</w:t>
+      </w:r>
+    </w:p>
+    <w:p>
+      <w:r>
+        <w:t>This is a local deployment simulation using historical model artifacts. The monitoring threshold requires operational calibration. Mean checks do not detect every distribution change and PASS does not establish unchanged prediction accuracy. Accuracy monitoring requires observed traffic volumes. Feature monitoring is a Python function rather than an HTTP endpoint. The system does not provide live traffic information or journey times.</w:t>
+      </w:r>
+    </w:p>
+    <w:p>
+      <w:r>
+        <w:br w:type="page"/>
+      </w:r>
+    </w:p>
+    <w:p>
+      <w:pPr>
+        <w:pStyle w:val="Heading1"/>
+        <w:rPr>
+          <w:b/>
+          <w:bCs/>
+        </w:rPr>
+      </w:pPr>
+      <w:r>
+        <w:rPr>
+          <w:b/>
+          <w:bCs/>
+        </w:rPr>
         <w:lastRenderedPageBreak/>
-        <w:t>Scope and limitations</w:t>
-      </w:r>
-    </w:p>
-    <w:p>
-      <w:r>
-        <w:t>This is a local deployment simulation using historical model artifacts. The monitoring threshold requires operational calibration. Mean checks do not detect every distribution change and PASS does not establish unchanged prediction accuracy. Accuracy monitoring requires observed traffic volumes. Feature monitoring is a Python function rather than an HTTP endpoint. The system does not provide live traffic information or journey times.</w:t>
+        <w:t>Task 7 Responsible and Sustainable AI</w:t>
+      </w:r>
+    </w:p>
+    <w:p>
+      <w:pPr>
+        <w:pStyle w:val="Heading2"/>
+      </w:pPr>
+      <w:r>
+        <w:t>Held out analysis and time groups</w:t>
+      </w:r>
+    </w:p>
+    <w:p>
+      <w:r>
+        <w:t>The analysis used 4944 saved held-out predictions from 14 April 2018 at 16:00 to 30 September 2018 at 23:00. Models remained fixed. Time group results included record counts, mean actual volume, mean absolute error and mean signed error, defined as prediction minus actual volume.</w:t>
+      </w:r>
+    </w:p>
+    <w:p>
+      <w:r>
+        <w:t>Random Forest MAE ranged from 97.14 at night to 330.02 in the morning. Neural Network MAE ranged from 116.40 at night to 324.96 in the morning. Each group had 1187 to 1298 records. Different traffic volumes affect interpretation of absolute errors; these differences alone do not establish unfairness.</w:t>
+      </w:r>
+    </w:p>
+    <w:p>
+      <w:r>
+        <w:rPr>
+          <w:noProof/>
+        </w:rPr>
+        <w:drawing>
+          <wp:inline distT="0" distB="0" distL="0" distR="0" wp14:anchorId="1C01A601" wp14:editId="064A28BE">
+            <wp:extent cx="6035040" cy="1656461"/>
+            <wp:effectExtent l="0" t="0" r="0" b="0"/>
+            <wp:docPr id="33" name="Picture 33"/>
+            <wp:cNvGraphicFramePr>
+              <a:graphicFrameLocks xmlns:a="http://schemas.openxmlformats.org/drawingml/2006/main" noChangeAspect="1"/>
+            </wp:cNvGraphicFramePr>
+            <a:graphic xmlns:a="http://schemas.openxmlformats.org/drawingml/2006/main">
+              <a:graphicData uri="http://schemas.openxmlformats.org/drawingml/2006/picture">
+                <pic:pic xmlns:pic="http://schemas.openxmlformats.org/drawingml/2006/picture">
+                  <pic:nvPicPr>
+                    <pic:cNvPr id="0" name="time_groups.png"/>
+                    <pic:cNvPicPr/>
+                  </pic:nvPicPr>
+                  <pic:blipFill>
+                    <a:blip r:embed="rId37"/>
+                    <a:stretch>
+                      <a:fillRect/>
+                    </a:stretch>
+                  </pic:blipFill>
+                  <pic:spPr>
+                    <a:xfrm>
+                      <a:off x="0" y="0"/>
+                      <a:ext cx="6035040" cy="1656461"/>
+                    </a:xfrm>
+                    <a:prstGeom prst="rect">
+                      <a:avLst/>
+                    </a:prstGeom>
+                  </pic:spPr>
+                </pic:pic>
+              </a:graphicData>
+            </a:graphic>
+          </wp:inline>
+        </w:drawing>
+      </w:r>
+    </w:p>
+    <w:p>
+      <w:pPr>
+        <w:pStyle w:val="Heading2"/>
+      </w:pPr>
+      <w:r>
+        <w:t>Weekday and weekend errors</w:t>
+      </w:r>
+    </w:p>
+    <w:p>
+      <w:r>
+        <w:t xml:space="preserve">Weekdays had 3517 records and weekends 1427. Random Forest MAE was 222.63 on weekdays and 320.35 on weekends. Neural Network MAE was 234.90 and 311.25 respectively. Average weekend volume was lower, yet both models had higher weekend absolute error. </w:t>
+      </w:r>
+    </w:p>
+    <w:p>
+      <w:r>
+        <w:rPr>
+          <w:noProof/>
+        </w:rPr>
+        <w:drawing>
+          <wp:inline distT="0" distB="0" distL="0" distR="0" wp14:anchorId="6609B339" wp14:editId="1D2D865F">
+            <wp:extent cx="6035040" cy="1002169"/>
+            <wp:effectExtent l="0" t="0" r="0" b="0"/>
+            <wp:docPr id="34" name="Picture 34"/>
+            <wp:cNvGraphicFramePr>
+              <a:graphicFrameLocks xmlns:a="http://schemas.openxmlformats.org/drawingml/2006/main" noChangeAspect="1"/>
+            </wp:cNvGraphicFramePr>
+            <a:graphic xmlns:a="http://schemas.openxmlformats.org/drawingml/2006/main">
+              <a:graphicData uri="http://schemas.openxmlformats.org/drawingml/2006/picture">
+                <pic:pic xmlns:pic="http://schemas.openxmlformats.org/drawingml/2006/picture">
+                  <pic:nvPicPr>
+                    <pic:cNvPr id="0" name="day_groups.png"/>
+                    <pic:cNvPicPr/>
+                  </pic:nvPicPr>
+                  <pic:blipFill>
+                    <a:blip r:embed="rId38"/>
+                    <a:stretch>
+                      <a:fillRect/>
+                    </a:stretch>
+                  </pic:blipFill>
+                  <pic:spPr>
+                    <a:xfrm>
+                      <a:off x="0" y="0"/>
+                      <a:ext cx="6035040" cy="1002169"/>
+                    </a:xfrm>
+                    <a:prstGeom prst="rect">
+                      <a:avLst/>
+                    </a:prstGeom>
+                  </pic:spPr>
+                </pic:pic>
+              </a:graphicData>
+            </a:graphic>
+          </wp:inline>
+        </w:drawing>
+      </w:r>
+    </w:p>
+    <w:p>
+      <w:r>
+        <w:t>Weather alignment and performance</w:t>
+      </w:r>
+    </w:p>
+    <w:p>
+      <w:r>
+        <w:t xml:space="preserve">The original cleaning and chronological split were repeated. Test timestamps and actual traffic volumes matched the saved prediction rows before weather labels were attached. </w:t>
+      </w:r>
+    </w:p>
+    <w:p>
+      <w:r>
+        <w:t>Snow had the highest observed MAE: 1125.13 for Random Forest and 1164.69 for the neural network, with average overprediction of approximately 1053 vehicles. Only 47 snow records supported these estimates. Fog had 112 records and MAE 444.55 and 435.23 respectively. Results are descriptive and do not show that weather alone caused the errors.</w:t>
+      </w:r>
+    </w:p>
+    <w:p>
+      <w:r>
+        <w:rPr>
+          <w:noProof/>
+        </w:rPr>
+        <w:lastRenderedPageBreak/>
+        <w:drawing>
+          <wp:inline distT="0" distB="0" distL="0" distR="0" wp14:anchorId="7688BD3B" wp14:editId="76D06EA6">
+            <wp:extent cx="6035040" cy="3496009"/>
+            <wp:effectExtent l="0" t="0" r="0" b="0"/>
+            <wp:docPr id="35" name="Picture 35"/>
+            <wp:cNvGraphicFramePr>
+              <a:graphicFrameLocks xmlns:a="http://schemas.openxmlformats.org/drawingml/2006/main" noChangeAspect="1"/>
+            </wp:cNvGraphicFramePr>
+            <a:graphic xmlns:a="http://schemas.openxmlformats.org/drawingml/2006/main">
+              <a:graphicData uri="http://schemas.openxmlformats.org/drawingml/2006/picture">
+                <pic:pic xmlns:pic="http://schemas.openxmlformats.org/drawingml/2006/picture">
+                  <pic:nvPicPr>
+                    <pic:cNvPr id="0" name="weather_errors.png"/>
+                    <pic:cNvPicPr/>
+                  </pic:nvPicPr>
+                  <pic:blipFill>
+                    <a:blip r:embed="rId39"/>
+                    <a:stretch>
+                      <a:fillRect/>
+                    </a:stretch>
+                  </pic:blipFill>
+                  <pic:spPr>
+                    <a:xfrm>
+                      <a:off x="0" y="0"/>
+                      <a:ext cx="6035040" cy="3496009"/>
+                    </a:xfrm>
+                    <a:prstGeom prst="rect">
+                      <a:avLst/>
+                    </a:prstGeom>
+                  </pic:spPr>
+                </pic:pic>
+              </a:graphicData>
+            </a:graphic>
+          </wp:inline>
+        </w:drawing>
+      </w:r>
+    </w:p>
+    <w:p>
+      <w:r>
+        <w:br w:type="page"/>
+      </w:r>
+    </w:p>
+    <w:p>
+      <w:pPr>
+        <w:pStyle w:val="Heading2"/>
+      </w:pPr>
+      <w:r>
+        <w:lastRenderedPageBreak/>
+        <w:t>Coverage and fairness limitations</w:t>
+      </w:r>
+    </w:p>
+    <w:p>
+      <w:r>
+        <w:t>Smoke had only two test records and squall had none. Groups below 100 records were flagged as limited evidence, a reporting rule rather than a statistical guarantee. The April to September test period did not cover a complete annual weather cycle. Records sharing an hourly timestamp are not independent observations.</w:t>
+      </w:r>
+    </w:p>
+    <w:p>
+      <w:r>
+        <w:rPr>
+          <w:noProof/>
+        </w:rPr>
+        <w:drawing>
+          <wp:inline distT="0" distB="0" distL="0" distR="0" wp14:anchorId="3531DE00" wp14:editId="551E7E0A">
+            <wp:extent cx="6035040" cy="1980334"/>
+            <wp:effectExtent l="0" t="0" r="0" b="0"/>
+            <wp:docPr id="36" name="Picture 36"/>
+            <wp:cNvGraphicFramePr>
+              <a:graphicFrameLocks xmlns:a="http://schemas.openxmlformats.org/drawingml/2006/main" noChangeAspect="1"/>
+            </wp:cNvGraphicFramePr>
+            <a:graphic xmlns:a="http://schemas.openxmlformats.org/drawingml/2006/main">
+              <a:graphicData uri="http://schemas.openxmlformats.org/drawingml/2006/picture">
+                <pic:pic xmlns:pic="http://schemas.openxmlformats.org/drawingml/2006/picture">
+                  <pic:nvPicPr>
+                    <pic:cNvPr id="0" name="weather_coverage.png"/>
+                    <pic:cNvPicPr/>
+                  </pic:nvPicPr>
+                  <pic:blipFill>
+                    <a:blip r:embed="rId40"/>
+                    <a:stretch>
+                      <a:fillRect/>
+                    </a:stretch>
+                  </pic:blipFill>
+                  <pic:spPr>
+                    <a:xfrm>
+                      <a:off x="0" y="0"/>
+                      <a:ext cx="6035040" cy="1980334"/>
+                    </a:xfrm>
+                    <a:prstGeom prst="rect">
+                      <a:avLst/>
+                    </a:prstGeom>
+                  </pic:spPr>
+                </pic:pic>
+              </a:graphicData>
+            </a:graphic>
+          </wp:inline>
+        </w:drawing>
+      </w:r>
+    </w:p>
+    <w:p>
+      <w:r>
+        <w:t xml:space="preserve">The dataset has no demographic attributes. Time, day and weather comparisons identify uneven errors and coverage limitations but cannot establish demographic fairness. </w:t>
+      </w:r>
+    </w:p>
+    <w:p>
+      <w:pPr>
+        <w:pStyle w:val="Heading2"/>
+      </w:pPr>
+      <w:r>
+        <w:t>Classification proxy and human oversight</w:t>
+      </w:r>
+    </w:p>
+    <w:p>
+      <w:r>
+        <w:t>HighRisk was constructed from traffic volume thresholds and selected weather conditions, not observed accidents or injuries. Weather features also helped define the label. Strong classification scores reflect reproduction of this rule rather than validated accident prediction. The proxy must not be used to declare journeys safe, issue penalties or make emergency decisions.</w:t>
+      </w:r>
+    </w:p>
+    <w:p>
+      <w:r>
+        <w:t>Recommendations should support human judgement alongside current incidents, road conditions and official information. Model versions, preparation settings, evaluation results and artifact hashes should be retained. Replacement models require validation and group performance review. Monitoring ALERT results require investigation rather than automatic retraining; PASS does not guarantee accuracy.</w:t>
+      </w:r>
+    </w:p>
+    <w:p>
+      <w:pPr>
+        <w:pStyle w:val="Heading2"/>
+      </w:pPr>
+      <w:r>
+        <w:t>Sustainability and saved report</w:t>
+      </w:r>
+    </w:p>
+    <w:p>
+      <w:r>
+        <w:t>Saved models were reused for recommendation and deployment. Early stopping completed neural network training after 37 epochs instead of the maximum 100. Energy and emissions were not measured, so environmental savings cannot be quantified and neither model is claimed to be greener. MLflow artifact copies support reproducibility but increase storage use. Retention policies and measured training time, latency, memory and energy use are recommended for future operational work.</w:t>
+      </w:r>
+    </w:p>
+    <w:p>
+      <w:r>
+        <w:t xml:space="preserve">The separate report </w:t>
+      </w:r>
+      <w:r>
+        <w:t>is</w:t>
+      </w:r>
+      <w:r>
+        <w:t xml:space="preserve"> saved as reports/responsible_sustainable_ai_report.md and converted to a Word version. Four CSV files retained time group errors, day group errors, weather group errors and weather coverage under results. The execution log was part3_smart_city_traffic_responsible_ai.log.</w:t>
+      </w:r>
+    </w:p>
+    <w:p>
+      <w:r>
+        <w:rPr>
+          <w:noProof/>
+        </w:rPr>
+        <w:drawing>
+          <wp:inline distT="0" distB="0" distL="0" distR="0" wp14:anchorId="0DD62FE2" wp14:editId="6CF7BA4E">
+            <wp:extent cx="6035040" cy="154603"/>
+            <wp:effectExtent l="0" t="0" r="0" b="0"/>
+            <wp:docPr id="37" name="Picture 37"/>
+            <wp:cNvGraphicFramePr>
+              <a:graphicFrameLocks xmlns:a="http://schemas.openxmlformats.org/drawingml/2006/main" noChangeAspect="1"/>
+            </wp:cNvGraphicFramePr>
+            <a:graphic xmlns:a="http://schemas.openxmlformats.org/drawingml/2006/main">
+              <a:graphicData uri="http://schemas.openxmlformats.org/drawingml/2006/picture">
+                <pic:pic xmlns:pic="http://schemas.openxmlformats.org/drawingml/2006/picture">
+                  <pic:nvPicPr>
+                    <pic:cNvPr id="0" name="report_saved.png"/>
+                    <pic:cNvPicPr/>
+                  </pic:nvPicPr>
+                  <pic:blipFill>
+                    <a:blip r:embed="rId41"/>
+                    <a:stretch>
+                      <a:fillRect/>
+                    </a:stretch>
+                  </pic:blipFill>
+                  <pic:spPr>
+                    <a:xfrm>
+                      <a:off x="0" y="0"/>
+                      <a:ext cx="6035040" cy="154603"/>
+                    </a:xfrm>
+                    <a:prstGeom prst="rect">
+                      <a:avLst/>
+                    </a:prstGeom>
+                  </pic:spPr>
+                </pic:pic>
+              </a:graphicData>
+            </a:graphic>
+          </wp:inline>
+        </w:drawing>
       </w:r>
     </w:p>
     <w:sectPr>

</xml_diff>

<commit_message>
Fix bug in Task 6 model version comparison.
</commit_message>
<xml_diff>
--- a/capstone_part3/Part3DEliverablesExecutionOutput.docx
+++ b/capstone_part3/Part3DEliverablesExecutionOutput.docx
@@ -35,13 +35,29 @@
         <w:t>10</w:t>
       </w:r>
       <w:r>
-        <w:t xml:space="preserve"> invalid temperature readings and on</w:t>
+        <w:t xml:space="preserve"> invalid temperature readings and </w:t>
+      </w:r>
+      <w:proofErr w:type="spellStart"/>
+      <w:r>
+        <w:t>on</w:t>
       </w:r>
       <w:r>
         <w:t xml:space="preserve"> </w:t>
       </w:r>
       <w:r>
-        <w:t>e invalid rainfall reading wre marked as missing</w:t>
+        <w:t>e</w:t>
+      </w:r>
+      <w:proofErr w:type="spellEnd"/>
+      <w:r>
+        <w:t xml:space="preserve"> invalid rainfall reading </w:t>
+      </w:r>
+      <w:proofErr w:type="spellStart"/>
+      <w:r>
+        <w:t>wre</w:t>
+      </w:r>
+      <w:proofErr w:type="spellEnd"/>
+      <w:r>
+        <w:t xml:space="preserve"> marked as missing</w:t>
       </w:r>
       <w:r>
         <w:t>.</w:t>
@@ -100,7 +116,15 @@
     </w:p>
     <w:p>
       <w:r>
-        <w:t>The split used 75 percent of unique timestamps for training, 15 percent for validation and 10 percent for testing. All records with the same timestamp stayed in one set. Training contained 35873 rows, validation 7370 and testing 4944. Missing temperature and rainfall values were filled using monthly medians calculatd from training data only, with training-wide medians as a fallback.</w:t>
+        <w:t xml:space="preserve">The split used 75 percent of unique timestamps for training, 15 percent for validation and 10 percent for testing. All records with the same timestamp stayed in one set. Training contained 35873 rows, validation 7370 and testing 4944. Missing temperature and rainfall values were filled using monthly medians </w:t>
+      </w:r>
+      <w:proofErr w:type="spellStart"/>
+      <w:r>
+        <w:t>calculatd</w:t>
+      </w:r>
+      <w:proofErr w:type="spellEnd"/>
+      <w:r>
+        <w:t xml:space="preserve"> from training data only, with training-wide medians as a fallback.</w:t>
       </w:r>
     </w:p>
     <w:p>
@@ -192,7 +216,15 @@
     </w:p>
     <w:p>
       <w:r>
-        <w:t>Training traffic-volume quartiles were 1175, 3349 and 4923. Values were categorised as Low, Medium, High or Severe. High risk required High or Severe trafic volume together with Snow, Thunderstorm or Squall, or low-visibility weather defined as Fog, Mist, Haze or Smoke. There were 3852 positive training labels, 1138 validation labels and 476 test labels. This proxy demonstrates classification and does not predict actual accidents. Weather is used in both the label definition and model inputs, which helps explain the strong classification scores.</w:t>
+        <w:t xml:space="preserve">Training traffic-volume quartiles were 1175, 3349 and 4923. Values were categorised as Low, Medium, High or Severe. High risk required High or Severe </w:t>
+      </w:r>
+      <w:proofErr w:type="spellStart"/>
+      <w:r>
+        <w:t>trafic</w:t>
+      </w:r>
+      <w:proofErr w:type="spellEnd"/>
+      <w:r>
+        <w:t xml:space="preserve"> volume together with Snow, Thunderstorm or Squall, or low-visibility weather defined as Fog, Mist, Haze or Smoke. There were 3852 positive training labels, 1138 validation labels and 476 test labels. This proxy demonstrates classification and does not predict actual accidents. Weather is used in both the label definition and model inputs, which helps explain the strong classification scores.</w:t>
       </w:r>
     </w:p>
     <w:p>
@@ -301,12 +333,21 @@
           <w:bCs/>
         </w:rPr>
       </w:pPr>
+      <w:proofErr w:type="spellStart"/>
       <w:r>
         <w:rPr>
           <w:b/>
           <w:bCs/>
         </w:rPr>
-        <w:t>lassification model comparison</w:t>
+        <w:t>lassification</w:t>
+      </w:r>
+      <w:proofErr w:type="spellEnd"/>
+      <w:r>
+        <w:rPr>
+          <w:b/>
+          <w:bCs/>
+        </w:rPr>
+        <w:t xml:space="preserve"> model comparison</w:t>
       </w:r>
     </w:p>
     <w:p>
@@ -433,7 +474,47 @@
     </w:p>
     <w:p>
       <w:r>
-        <w:t xml:space="preserve">Four model pipelines were saved as version 1 joblib files, together with preparation_config_v1.joblib. Four CSV fies record regresion and classification validation and test results. Reloaded models reproduced predictions and classifier probablities on 20 validation examples. </w:t>
+        <w:t xml:space="preserve">Four model pipelines were saved as version 1 </w:t>
+      </w:r>
+      <w:proofErr w:type="spellStart"/>
+      <w:r>
+        <w:t>joblib</w:t>
+      </w:r>
+      <w:proofErr w:type="spellEnd"/>
+      <w:r>
+        <w:t xml:space="preserve"> files, together with preparation_config_v</w:t>
+      </w:r>
+      <w:proofErr w:type="gramStart"/>
+      <w:r>
+        <w:t>1.joblib</w:t>
+      </w:r>
+      <w:proofErr w:type="gramEnd"/>
+      <w:r>
+        <w:t xml:space="preserve">. Four CSV </w:t>
+      </w:r>
+      <w:proofErr w:type="spellStart"/>
+      <w:r>
+        <w:t>fies</w:t>
+      </w:r>
+      <w:proofErr w:type="spellEnd"/>
+      <w:r>
+        <w:t xml:space="preserve"> record </w:t>
+      </w:r>
+      <w:proofErr w:type="spellStart"/>
+      <w:r>
+        <w:t>regresion</w:t>
+      </w:r>
+      <w:proofErr w:type="spellEnd"/>
+      <w:r>
+        <w:t xml:space="preserve"> and classification validation and test results. Reloaded models reproduced predictions and classifier </w:t>
+      </w:r>
+      <w:proofErr w:type="spellStart"/>
+      <w:r>
+        <w:t>probablities</w:t>
+      </w:r>
+      <w:proofErr w:type="spellEnd"/>
+      <w:r>
+        <w:t xml:space="preserve"> on 20 validation examples. </w:t>
       </w:r>
     </w:p>
     <w:p>
@@ -715,7 +796,39 @@
     </w:p>
     <w:p>
       <w:r>
-        <w:t xml:space="preserve">Weekend nights with Mist had Low trafic volume in 511 of 558 matching records, giving confidence 91.6 percent, support 1.06 percent and lift 3.6630. Weekend nights overall had Low trffic volume in 3104 of 3503 records, conidence 88.6 percent and lift 3.5443. The nex rules were weekend nights with Clouds, nights with Snow, and weekend nights with Clear weather. </w:t>
+        <w:t xml:space="preserve">Weekend nights with Mist had Low </w:t>
+      </w:r>
+      <w:proofErr w:type="spellStart"/>
+      <w:r>
+        <w:t>trafic</w:t>
+      </w:r>
+      <w:proofErr w:type="spellEnd"/>
+      <w:r>
+        <w:t xml:space="preserve"> volume in 511 of 558 matching records, giving confidence 91.6 percent, support 1.06 percent and lift 3.6630. Weekend nights overall had Low </w:t>
+      </w:r>
+      <w:proofErr w:type="spellStart"/>
+      <w:r>
+        <w:t>trffic</w:t>
+      </w:r>
+      <w:proofErr w:type="spellEnd"/>
+      <w:r>
+        <w:t xml:space="preserve"> volume in 3104 of 3503 records, </w:t>
+      </w:r>
+      <w:proofErr w:type="spellStart"/>
+      <w:r>
+        <w:t>conidence</w:t>
+      </w:r>
+      <w:proofErr w:type="spellEnd"/>
+      <w:r>
+        <w:t xml:space="preserve"> 88.6 percent and lift 3.5443. The </w:t>
+      </w:r>
+      <w:proofErr w:type="spellStart"/>
+      <w:r>
+        <w:t>nex</w:t>
+      </w:r>
+      <w:proofErr w:type="spellEnd"/>
+      <w:r>
+        <w:t xml:space="preserve"> rules were weekend nights with Clouds, nights with Snow, and weekend nights with Clear weather. </w:t>
       </w:r>
     </w:p>
     <w:p>
@@ -860,13 +973,37 @@
     </w:p>
     <w:p>
       <w:r>
-        <w:t>The feedforward network used two hidden layers with 64 and 32 ReLU neurons and a single linear output. Training used Adam with learning ra</w:t>
+        <w:t xml:space="preserve">The feedforward network used two hidden layers with 64 and 32 </w:t>
+      </w:r>
+      <w:proofErr w:type="spellStart"/>
+      <w:r>
+        <w:t>ReLU</w:t>
+      </w:r>
+      <w:proofErr w:type="spellEnd"/>
+      <w:r>
+        <w:t xml:space="preserve"> neurons and a single linear output. Training used Adam with learning </w:t>
+      </w:r>
+      <w:proofErr w:type="spellStart"/>
+      <w:r>
+        <w:t>ra</w:t>
       </w:r>
       <w:r>
         <w:t>t</w:t>
       </w:r>
       <w:r>
-        <w:t>te 0.001, mean squared error loss and batch size 256. The trget was standardised using the training mean and standard deviation. Earl</w:t>
+        <w:t>te</w:t>
+      </w:r>
+      <w:proofErr w:type="spellEnd"/>
+      <w:r>
+        <w:t xml:space="preserve"> 0.001, mean squared error loss and batch size 256. The </w:t>
+      </w:r>
+      <w:proofErr w:type="spellStart"/>
+      <w:r>
+        <w:t>trget</w:t>
+      </w:r>
+      <w:proofErr w:type="spellEnd"/>
+      <w:r>
+        <w:t xml:space="preserve"> was standardised using the training mean and standard deviation. Earl</w:t>
       </w:r>
       <w:r>
         <w:t xml:space="preserve"> </w:t>
@@ -1145,7 +1282,31 @@
     </w:p>
     <w:p>
       <w:r>
-        <w:t>The network was saved as neural_network_traffic_v1.keras. The fitted preprocessor and configuration were saved as neural_network_preprocessor_v1.joblib and neural_network_config_v1.joblib. Configuration included the target scaling, feature list, imputation values, architecture, training settings, completed epochs and package versions.</w:t>
+        <w:t>The network was saved as neural_network_traffic_v</w:t>
+      </w:r>
+      <w:proofErr w:type="gramStart"/>
+      <w:r>
+        <w:t>1.keras</w:t>
+      </w:r>
+      <w:proofErr w:type="gramEnd"/>
+      <w:r>
+        <w:t>. The fitted preprocessor and configuration were saved as neural_network_preprocessor_v</w:t>
+      </w:r>
+      <w:proofErr w:type="gramStart"/>
+      <w:r>
+        <w:t>1.joblib</w:t>
+      </w:r>
+      <w:proofErr w:type="gramEnd"/>
+      <w:r>
+        <w:t xml:space="preserve"> and neural_network_config_v</w:t>
+      </w:r>
+      <w:proofErr w:type="gramStart"/>
+      <w:r>
+        <w:t>1.joblib</w:t>
+      </w:r>
+      <w:proofErr w:type="gramEnd"/>
+      <w:r>
+        <w:t>. Configuration included the target scaling, feature list, imputation values, architecture, training settings, completed epochs and package versions.</w:t>
       </w:r>
     </w:p>
     <w:p>
@@ -1216,13 +1377,23 @@
       <w:pPr>
         <w:pStyle w:val="Heading2"/>
       </w:pPr>
-      <w:r>
-        <w:t>MLflow experiment tracking</w:t>
-      </w:r>
-    </w:p>
-    <w:p>
-      <w:r>
-        <w:t xml:space="preserve">MLflow 3.17.0 imported successfully. Experiment tracking was used to record the existing Random Forest and neural network regression evaluations from Tasks 1 and 3. Each run retained model settings, version identifiers, validation and test metrics, and supporting artifacts. </w:t>
+      <w:proofErr w:type="spellStart"/>
+      <w:r>
+        <w:t>MLflow</w:t>
+      </w:r>
+      <w:proofErr w:type="spellEnd"/>
+      <w:r>
+        <w:t xml:space="preserve"> experiment tracking</w:t>
+      </w:r>
+    </w:p>
+    <w:p>
+      <w:proofErr w:type="spellStart"/>
+      <w:r>
+        <w:t>MLflow</w:t>
+      </w:r>
+      <w:proofErr w:type="spellEnd"/>
+      <w:r>
+        <w:t xml:space="preserve"> 3.17.0 imported successfully. Experiment tracking was used to record the existing Random Forest and neural network regression evaluations from Tasks 1 and 3. Each run retained model settings, version identifiers, validation and test metrics, and supporting artifacts. </w:t>
       </w:r>
     </w:p>
     <w:p>
@@ -1348,13 +1519,21 @@
     </w:p>
     <w:p>
       <w:r>
-        <w:t>Random Forest validation MAE was 317.5692 and R squared 0.9256; test MAE was 250.8358 and R squared 0.9448. Neural Net</w:t>
+        <w:t xml:space="preserve">Random Forest validation MAE was 317.5692 and R squared 0.9256; test MAE was 250.8358 and R squared 0.9448. Neural </w:t>
+      </w:r>
+      <w:proofErr w:type="spellStart"/>
+      <w:r>
+        <w:t>Net</w:t>
       </w:r>
       <w:r>
         <w:t>t</w:t>
       </w:r>
       <w:r>
-        <w:t>work validation MAE was 316.4414 and R squared 0.9307; test MAE was 256.9366 and R squared 0.9455. Saved model files were logged as artifacts together with preparation settings, figures and readable evaluation JSON files. The neural network run also retained training history.</w:t>
+        <w:t>work</w:t>
+      </w:r>
+      <w:proofErr w:type="spellEnd"/>
+      <w:r>
+        <w:t xml:space="preserve"> validation MAE was 316.4414 and R squared 0.9307; test MAE was 256.9366 and R squared 0.9455. Saved model files were logged as artifacts together with preparation settings, figures and readable evaluation JSON files. The neural network run also retained training history.</w:t>
       </w:r>
     </w:p>
     <w:p>
@@ -1373,7 +1552,23 @@
     </w:p>
     <w:p>
       <w:r>
-        <w:t xml:space="preserve">Both runs retrieved through MlflowClient and had FINISHED status. Stored metrics matched the original results within numerical tolerance, and the model_version parameter was v1. </w:t>
+        <w:t xml:space="preserve">Both runs retrieved through </w:t>
+      </w:r>
+      <w:proofErr w:type="spellStart"/>
+      <w:r>
+        <w:t>MlflowClient</w:t>
+      </w:r>
+      <w:proofErr w:type="spellEnd"/>
+      <w:r>
+        <w:t xml:space="preserve"> and had FINISHED status. Stored metrics matched the original results within numerical tolerance, and the </w:t>
+      </w:r>
+      <w:proofErr w:type="spellStart"/>
+      <w:r>
+        <w:t>model_version</w:t>
+      </w:r>
+      <w:proofErr w:type="spellEnd"/>
+      <w:r>
+        <w:t xml:space="preserve"> parameter was v1. </w:t>
       </w:r>
     </w:p>
     <w:p>
@@ -1427,8 +1622,13 @@
       </w:r>
     </w:p>
     <w:p>
-      <w:r>
-        <w:t>MLflow brings the model settings, evaluation metrics and supporting artifacts together under identifiable runs. This makes the existing models easier to compare and supports later deployment and monitoring work.</w:t>
+      <w:proofErr w:type="spellStart"/>
+      <w:r>
+        <w:t>MLflow</w:t>
+      </w:r>
+      <w:proofErr w:type="spellEnd"/>
+      <w:r>
+        <w:t xml:space="preserve"> brings the model settings, evaluation metrics and supporting artifacts together under identifiable runs. This makes the existing models easier to compare and supports later deployment and monitoring work.</w:t>
       </w:r>
     </w:p>
     <w:p>
@@ -1628,7 +1828,15 @@
     </w:p>
     <w:p>
       <w:r>
-        <w:t xml:space="preserve">The input preparation and travel window recommendation functions saved in recommendation_system/recommender.py. </w:t>
+        <w:t xml:space="preserve">The input preparation and travel window recommendation functions saved in </w:t>
+      </w:r>
+      <w:proofErr w:type="spellStart"/>
+      <w:r>
+        <w:t>recommendation_system</w:t>
+      </w:r>
+      <w:proofErr w:type="spellEnd"/>
+      <w:r>
+        <w:t xml:space="preserve">/recommender.py. </w:t>
       </w:r>
     </w:p>
     <w:p>
@@ -1705,7 +1913,23 @@
           <w:bCs/>
         </w:rPr>
         <w:lastRenderedPageBreak/>
-        <w:t>Task 6 MLOps and Deployment Simulation</w:t>
+        <w:t xml:space="preserve">Task 6 </w:t>
+      </w:r>
+      <w:proofErr w:type="spellStart"/>
+      <w:r>
+        <w:rPr>
+          <w:b/>
+          <w:bCs/>
+        </w:rPr>
+        <w:t>MLOps</w:t>
+      </w:r>
+      <w:proofErr w:type="spellEnd"/>
+      <w:r>
+        <w:rPr>
+          <w:b/>
+          <w:bCs/>
+        </w:rPr>
+        <w:t xml:space="preserve"> and Deployment Simulation</w:t>
       </w:r>
     </w:p>
     <w:p>
@@ -1768,7 +1992,81 @@
         <w:pStyle w:val="Heading2"/>
       </w:pPr>
       <w:r>
-        <w:t>API behavior and validation</w:t>
+        <w:t>Model version comparison</w:t>
+      </w:r>
+    </w:p>
+    <w:p>
+      <w:r>
+        <w:t>The two saved traffic-volume models are compared using their existing validation and held-out test results. Each model family has its own version v1, these are distinct artifacts, not successive releases of one model. Random Forest v1 remains deployed in the local API and Neural Network v1 is retained as a comparison candidate.</w:t>
+      </w:r>
+    </w:p>
+    <w:p>
+      <w:r>
+        <w:t>Random Forest test MAE was 250.84 and R-squared 0.9448. Neural Network test MAE was 256.94 and R-squared 0.9455. The comparison is saved to results/deployment_model_version_comparison.csv.</w:t>
+      </w:r>
+    </w:p>
+    <w:p>
+      <w:r>
+        <w:rPr>
+          <w:noProof/>
+        </w:rPr>
+        <w:drawing>
+          <wp:inline distT="0" distB="0" distL="0" distR="0" wp14:anchorId="57F21F92" wp14:editId="7EB21554">
+            <wp:extent cx="5943600" cy="742278"/>
+            <wp:effectExtent l="0" t="0" r="0" b="0"/>
+            <wp:docPr id="38" name="Picture 38"/>
+            <wp:cNvGraphicFramePr>
+              <a:graphicFrameLocks xmlns:a="http://schemas.openxmlformats.org/drawingml/2006/main" noChangeAspect="1"/>
+            </wp:cNvGraphicFramePr>
+            <a:graphic xmlns:a="http://schemas.openxmlformats.org/drawingml/2006/main">
+              <a:graphicData uri="http://schemas.openxmlformats.org/drawingml/2006/picture">
+                <pic:pic xmlns:pic="http://schemas.openxmlformats.org/drawingml/2006/picture">
+                  <pic:nvPicPr>
+                    <pic:cNvPr id="0" name="task6_version_comparison.png"/>
+                    <pic:cNvPicPr/>
+                  </pic:nvPicPr>
+                  <pic:blipFill>
+                    <a:blip r:embed="rId30"/>
+                    <a:stretch>
+                      <a:fillRect/>
+                    </a:stretch>
+                  </pic:blipFill>
+                  <pic:spPr>
+                    <a:xfrm>
+                      <a:off x="0" y="0"/>
+                      <a:ext cx="5943600" cy="742278"/>
+                    </a:xfrm>
+                    <a:prstGeom prst="rect">
+                      <a:avLst/>
+                    </a:prstGeom>
+                  </pic:spPr>
+                </pic:pic>
+              </a:graphicData>
+            </a:graphic>
+          </wp:inline>
+        </w:drawing>
+      </w:r>
+    </w:p>
+    <w:p>
+      <w:r>
+        <w:br w:type="page"/>
+      </w:r>
+    </w:p>
+    <w:p>
+      <w:pPr>
+        <w:pStyle w:val="Heading2"/>
+      </w:pPr>
+      <w:r>
+        <w:lastRenderedPageBreak/>
+        <w:t xml:space="preserve">API </w:t>
+      </w:r>
+      <w:proofErr w:type="spellStart"/>
+      <w:r>
+        <w:t>behavior</w:t>
+      </w:r>
+      <w:proofErr w:type="spellEnd"/>
+      <w:r>
+        <w:t xml:space="preserve"> and validation</w:t>
       </w:r>
     </w:p>
     <w:p>
@@ -1792,7 +2090,7 @@
                     <pic:cNvPicPr/>
                   </pic:nvPicPr>
                   <pic:blipFill>
-                    <a:blip r:embed="rId30"/>
+                    <a:blip r:embed="rId31"/>
                     <a:stretch>
                       <a:fillRect/>
                     </a:stretch>
@@ -1842,7 +2140,7 @@
                     <pic:cNvPicPr/>
                   </pic:nvPicPr>
                   <pic:blipFill>
-                    <a:blip r:embed="rId31"/>
+                    <a:blip r:embed="rId32"/>
                     <a:stretch>
                       <a:fillRect/>
                     </a:stretch>
@@ -1894,7 +2192,7 @@
                     <pic:cNvPicPr/>
                   </pic:nvPicPr>
                   <pic:blipFill>
-                    <a:blip r:embed="rId32"/>
+                    <a:blip r:embed="rId33"/>
                     <a:stretch>
                       <a:fillRect/>
                     </a:stretch>
@@ -1950,7 +2248,7 @@
                     <pic:cNvPicPr/>
                   </pic:nvPicPr>
                   <pic:blipFill>
-                    <a:blip r:embed="rId33"/>
+                    <a:blip r:embed="rId34"/>
                     <a:stretch>
                       <a:fillRect/>
                     </a:stretch>
@@ -1973,7 +2271,15 @@
     </w:p>
     <w:p>
       <w:r>
-        <w:t>The startup command launched Uvicorn successfully on 127.0.0.1 port 8000.</w:t>
+        <w:t xml:space="preserve">The startup command launched </w:t>
+      </w:r>
+      <w:proofErr w:type="spellStart"/>
+      <w:r>
+        <w:t>Uvicorn</w:t>
+      </w:r>
+      <w:proofErr w:type="spellEnd"/>
+      <w:r>
+        <w:t xml:space="preserve"> successfully on 127.0.0.1 port 8000.</w:t>
       </w:r>
     </w:p>
     <w:p>
@@ -1992,24 +2298,63 @@
         <w:t>are</w:t>
       </w:r>
       <w:r>
-        <w:t xml:space="preserve"> saved in deployment/app.py. It loads deployment_manifest.json and monitoring_reference.json, v</w:t>
+        <w:t xml:space="preserve"> saved in deployment/app.py. It loads </w:t>
+      </w:r>
+      <w:proofErr w:type="spellStart"/>
+      <w:r>
+        <w:t>deployment_</w:t>
+      </w:r>
+      <w:proofErr w:type="gramStart"/>
+      <w:r>
+        <w:t>manifest.json</w:t>
+      </w:r>
+      <w:proofErr w:type="spellEnd"/>
+      <w:proofErr w:type="gramEnd"/>
+      <w:r>
+        <w:t xml:space="preserve"> and </w:t>
+      </w:r>
+      <w:proofErr w:type="spellStart"/>
+      <w:r>
+        <w:t>monitoring_</w:t>
+      </w:r>
+      <w:proofErr w:type="gramStart"/>
+      <w:r>
+        <w:t>reference.json</w:t>
+      </w:r>
+      <w:proofErr w:type="spellEnd"/>
+      <w:proofErr w:type="gramEnd"/>
+      <w:r>
+        <w:t>, v</w:t>
       </w:r>
       <w:r>
         <w:t>e</w:t>
       </w:r>
       <w:r>
-        <w:t>rifies artifact hashes and locates the Task 5 feature preparation module relative to its o</w:t>
-      </w:r>
+        <w:t xml:space="preserve">rifies artifact hashes and locates the Task 5 feature preparation module relative to its </w:t>
+      </w:r>
+      <w:proofErr w:type="spellStart"/>
       <w:r>
         <w:t>o</w:t>
       </w:r>
       <w:r>
-        <w:t>wn location. Import checks reproduced API metadata and timestamps exactly, prediction values within tight tolerance, and both monitoring outcomes.</w:t>
-      </w:r>
-    </w:p>
-    <w:p>
-      <w:r>
-        <w:t>Uvicorn served the application on 127.0.0.1 port 8000. Actual HTTP requests confirmed health and prediction responses with HTTP 200, preserved input order and matched direct inference. Invalid cloud cover returned HTTP 422. Verification tables and a live prediction response were saved.</w:t>
+        <w:t>o</w:t>
+      </w:r>
+      <w:r>
+        <w:t>wn</w:t>
+      </w:r>
+      <w:proofErr w:type="spellEnd"/>
+      <w:r>
+        <w:t xml:space="preserve"> location. Import checks reproduced API metadata and timestamps exactly, prediction values within tight tolerance, and both monitoring outcomes.</w:t>
+      </w:r>
+    </w:p>
+    <w:p>
+      <w:proofErr w:type="spellStart"/>
+      <w:r>
+        <w:t>Uvicorn</w:t>
+      </w:r>
+      <w:proofErr w:type="spellEnd"/>
+      <w:r>
+        <w:t xml:space="preserve"> served the application on 127.0.0.1 port 8000. Actual HTTP requests confirmed health and prediction responses with HTTP 200, preserved input order and matched direct inference. Invalid cloud cover returned HTTP 422. Verification tables and a live prediction response were saved.</w:t>
       </w:r>
     </w:p>
     <w:p>
@@ -2033,7 +2378,7 @@
                     <pic:cNvPicPr/>
                   </pic:nvPicPr>
                   <pic:blipFill>
-                    <a:blip r:embed="rId34"/>
+                    <a:blip r:embed="rId35"/>
                     <a:stretch>
                       <a:fillRect/>
                     </a:stretch>
@@ -2096,7 +2441,7 @@
                     <pic:cNvPicPr/>
                   </pic:nvPicPr>
                   <pic:blipFill>
-                    <a:blip r:embed="rId35"/>
+                    <a:blip r:embed="rId36"/>
                     <a:stretch>
                       <a:fillRect/>
                     </a:stretch>
@@ -2144,7 +2489,7 @@
                     <pic:cNvPicPr/>
                   </pic:nvPicPr>
                   <pic:blipFill>
-                    <a:blip r:embed="rId36"/>
+                    <a:blip r:embed="rId37"/>
                     <a:stretch>
                       <a:fillRect/>
                     </a:stretch>
@@ -2244,7 +2589,7 @@
                     <pic:cNvPicPr/>
                   </pic:nvPicPr>
                   <pic:blipFill>
-                    <a:blip r:embed="rId37"/>
+                    <a:blip r:embed="rId38"/>
                     <a:stretch>
                       <a:fillRect/>
                     </a:stretch>
@@ -2299,7 +2644,7 @@
                     <pic:cNvPicPr/>
                   </pic:nvPicPr>
                   <pic:blipFill>
-                    <a:blip r:embed="rId38"/>
+                    <a:blip r:embed="rId39"/>
                     <a:stretch>
                       <a:fillRect/>
                     </a:stretch>
@@ -2357,7 +2702,7 @@
                     <pic:cNvPicPr/>
                   </pic:nvPicPr>
                   <pic:blipFill>
-                    <a:blip r:embed="rId39"/>
+                    <a:blip r:embed="rId40"/>
                     <a:stretch>
                       <a:fillRect/>
                     </a:stretch>
@@ -2418,7 +2763,7 @@
                     <pic:cNvPicPr/>
                   </pic:nvPicPr>
                   <pic:blipFill>
-                    <a:blip r:embed="rId40"/>
+                    <a:blip r:embed="rId41"/>
                     <a:stretch>
                       <a:fillRect/>
                     </a:stretch>
@@ -2453,8 +2798,13 @@
       </w:r>
     </w:p>
     <w:p>
-      <w:r>
-        <w:t>HighRisk was constructed from traffic volume thresholds and selected weather conditions, not observed accidents or injuries. Weather features also helped define the label. Strong classification scores reflect reproduction of this rule rather than validated accident prediction. The proxy must not be used to declare journeys safe, issue penalties or make emergency decisions.</w:t>
+      <w:proofErr w:type="spellStart"/>
+      <w:r>
+        <w:t>HighRisk</w:t>
+      </w:r>
+      <w:proofErr w:type="spellEnd"/>
+      <w:r>
+        <w:t xml:space="preserve"> was constructed from traffic volume thresholds and selected weather conditions, not observed accidents or injuries. Weather features also helped define the label. Strong classification scores reflect reproduction of this rule rather than validated accident prediction. The proxy must not be used to declare journeys safe, issue penalties or make emergency decisions.</w:t>
       </w:r>
     </w:p>
     <w:p>
@@ -2472,7 +2822,15 @@
     </w:p>
     <w:p>
       <w:r>
-        <w:t>Saved models were reused for recommendation and deployment. Early stopping completed neural network training after 37 epochs instead of the maximum 100. Energy and emissions were not measured, so environmental savings cannot be quantified and neither model is claimed to be greener. MLflow artifact copies support reproducibility but increase storage use. Retention policies and measured training time, latency, memory and energy use are recommended for future operational work.</w:t>
+        <w:t xml:space="preserve">Saved models were reused for recommendation and deployment. Early stopping completed neural network training after 37 epochs instead of the maximum 100. Energy and emissions were not measured, so environmental savings cannot be quantified and neither model is claimed to be greener. </w:t>
+      </w:r>
+      <w:proofErr w:type="spellStart"/>
+      <w:r>
+        <w:t>MLflow</w:t>
+      </w:r>
+      <w:proofErr w:type="spellEnd"/>
+      <w:r>
+        <w:t xml:space="preserve"> artifact copies support reproducibility but increase storage use. Retention policies and measured training time, latency, memory and energy use are recommended for future operational work.</w:t>
       </w:r>
     </w:p>
     <w:p>
@@ -2507,7 +2865,7 @@
                     <pic:cNvPicPr/>
                   </pic:nvPicPr>
                   <pic:blipFill>
-                    <a:blip r:embed="rId41"/>
+                    <a:blip r:embed="rId42"/>
                     <a:stretch>
                       <a:fillRect/>
                     </a:stretch>

</xml_diff>